<commit_message>
Aplica el manual de marca USB y el logo del CEA
- Encabezado con logos de la USB y del CEA, y franja institucional en el pie.
- Paleta institucional (negro #1D1D1B, naranja #EF7D00) con el azul y el
  turquesa del CEA para las rutas; contraste AA en todo el texto.
- Títulos en Montserrat con mezcla de pesos y números de estilo universitario.
- PDF y Word regenerados con la misma identidad y los logos en la portada.

Co-Authored-By: Claude Opus 5.5 <noreply@anthropic.com>
</commit_message>
<xml_diff>
--- a/word/Capsula_01_Conoce_tu_aula_virtual.docx
+++ b/word/Capsula_01_Conoce_tu_aula_virtual.docx
@@ -2,6 +2,52 @@
 <file path=word/document.xml><?xml version="1.0" encoding="utf-8"?>
 <w:document xmlns:wpc="http://schemas.microsoft.com/office/word/2010/wordprocessingCanvas" xmlns:mc="http://schemas.openxmlformats.org/markup-compatibility/2006" xmlns:o="urn:schemas-microsoft-com:office:office" xmlns:r="http://schemas.openxmlformats.org/officeDocument/2006/relationships" xmlns:m="http://schemas.openxmlformats.org/officeDocument/2006/math" xmlns:v="urn:schemas-microsoft-com:vml" xmlns:wp14="http://schemas.microsoft.com/office/word/2010/wordprocessingDrawing" xmlns:wp="http://schemas.openxmlformats.org/drawingml/2006/wordprocessingDrawing" xmlns:w10="urn:schemas-microsoft-com:office:word" xmlns:w="http://schemas.openxmlformats.org/wordprocessingml/2006/main" xmlns:w14="http://schemas.microsoft.com/office/word/2010/wordml" xmlns:w15="http://schemas.microsoft.com/office/word/2012/wordml" xmlns:wpg="http://schemas.microsoft.com/office/word/2010/wordprocessingGroup" xmlns:wpi="http://schemas.microsoft.com/office/word/2010/wordprocessingInk" xmlns:wne="http://schemas.microsoft.com/office/word/2006/wordml" xmlns:wps="http://schemas.microsoft.com/office/word/2010/wordprocessingShape" xmlns:cx="http://schemas.microsoft.com/office/drawing/2014/chartex" xmlns:cx1="http://schemas.microsoft.com/office/drawing/2015/9/8/chartex" xmlns:cx2="http://schemas.microsoft.com/office/drawing/2015/10/21/chartex" xmlns:cx3="http://schemas.microsoft.com/office/drawing/2016/5/9/chartex" xmlns:cx4="http://schemas.microsoft.com/office/drawing/2016/5/10/chartex" xmlns:cx5="http://schemas.microsoft.com/office/drawing/2016/5/11/chartex" xmlns:cx6="http://schemas.microsoft.com/office/drawing/2016/5/12/chartex" xmlns:cx7="http://schemas.microsoft.com/office/drawing/2016/5/13/chartex" xmlns:cx8="http://schemas.microsoft.com/office/drawing/2016/5/14/chartex" xmlns:aink="http://schemas.microsoft.com/office/drawing/2016/ink" xmlns:am3d="http://schemas.microsoft.com/office/drawing/2017/model3d" xmlns:w16cex="http://schemas.microsoft.com/office/word/2018/wordml/cex" xmlns:w16cid="http://schemas.microsoft.com/office/word/2016/wordml/cid" xmlns:w16="http://schemas.microsoft.com/office/word/2018/wordml" xmlns:w16sdtdh="http://schemas.microsoft.com/office/word/2020/wordml/sdtdatahash" xmlns:w16se="http://schemas.microsoft.com/office/word/2015/wordml/symex" mc:Ignorable="w14 w15 wp14">
   <w:body>
+    <w:p>
+      <w:pPr>
+        <w:spacing w:after="200"/>
+        <w:jc w:val="center"/>
+      </w:pPr>
+      <w:r>
+        <w:drawing>
+          <wp:inline distT="0" distB="0" distL="0" distR="0">
+            <wp:extent cx="5143500" cy="914400"/>
+            <wp:effectExtent t="0" r="0" b="0" l="0"/>
+            <wp:docPr id="1" name="logos" descr="Universidad de San Buenaventura, Acreditación Institucional Multicampus de Alta Calidad y CEA" title="Logos institucionales"/>
+            <wp:cNvGraphicFramePr>
+              <a:graphicFrameLocks xmlns:a="http://schemas.openxmlformats.org/drawingml/2006/main" noChangeAspect="1"/>
+            </wp:cNvGraphicFramePr>
+            <a:graphic xmlns:a="http://schemas.openxmlformats.org/drawingml/2006/main">
+              <a:graphicData uri="http://schemas.openxmlformats.org/drawingml/2006/picture">
+                <pic:pic xmlns:pic="http://schemas.openxmlformats.org/drawingml/2006/picture">
+                  <pic:nvPicPr>
+                    <pic:cNvPr id="0" name="" descr=""/>
+                    <pic:cNvPicPr>
+                      <a:picLocks noChangeAspect="1" noChangeArrowheads="1"/>
+                    </pic:cNvPicPr>
+                  </pic:nvPicPr>
+                  <pic:blipFill>
+                    <a:blip r:embed="rId9" cstate="none"/>
+                    <a:srcRect/>
+                    <a:stretch>
+                      <a:fillRect/>
+                    </a:stretch>
+                  </pic:blipFill>
+                  <pic:spPr bwMode="auto">
+                    <a:xfrm>
+                      <a:off x="0" y="0"/>
+                      <a:ext cx="5143500" cy="914400"/>
+                    </a:xfrm>
+                    <a:prstGeom prst="rect">
+                      <a:avLst/>
+                    </a:prstGeom>
+                  </pic:spPr>
+                </pic:pic>
+              </a:graphicData>
+            </a:graphic>
+          </wp:inline>
+        </w:drawing>
+      </w:r>
+    </w:p>
     <w:tbl>
       <w:tblPr>
         <w:tblW w:type="dxa" w:w="10080"/>
@@ -28,7 +74,7 @@
               <w:bottom w:val="none" w:color="FFFFFF" w:sz="0"/>
               <w:right w:val="none" w:color="FFFFFF" w:sz="0"/>
             </w:tcBorders>
-            <w:shd w:fill="0F766E" w:color="auto" w:val="clear"/>
+            <w:shd w:fill="0A4A92" w:color="auto" w:val="clear"/>
             <w:tcMar>
               <w:top w:type="dxa" w:w="360"/>
               <w:left w:type="dxa" w:w="360"/>
@@ -72,6 +118,14 @@
         </w:tc>
       </w:tr>
     </w:tbl>
+    <w:p>
+      <w:pPr>
+        <w:pBdr>
+          <w:top w:val="single" w:color="EF7D00" w:sz="36" w:space="0"/>
+        </w:pBdr>
+        <w:spacing w:after="0"/>
+      </w:pPr>
+    </w:p>
     <w:tbl>
       <w:tblPr>
         <w:tblW w:type="dxa" w:w="10080"/>
@@ -81,7 +135,7 @@
           <w:bottom w:val="none" w:color="FFFFFF" w:sz="0"/>
           <w:right w:val="none" w:color="FFFFFF" w:sz="0"/>
           <w:insideH w:val="none" w:color="FFFFFF" w:sz="0"/>
-          <w:insideV w:val="single" w:color="E5E7EB" w:sz="4"/>
+          <w:insideV w:val="single" w:color="E2E2DF" w:sz="4"/>
         </w:tblBorders>
         <w:tblLayout w:type="fixed"/>
       </w:tblPr>
@@ -95,7 +149,7 @@
         <w:tc>
           <w:tcPr>
             <w:tcW w:type="dxa" w:w="2520"/>
-            <w:shd w:fill="E7F5F2" w:color="auto" w:val="clear"/>
+            <w:shd w:fill="E8EEF7" w:color="auto" w:val="clear"/>
             <w:tcMar>
               <w:top w:type="dxa" w:w="140"/>
               <w:left w:type="dxa" w:w="200"/>
@@ -112,7 +166,7 @@
                 <w:rFonts w:ascii="Calibri" w:cs="Calibri" w:eastAsia="Calibri" w:hAnsi="Calibri"/>
                 <w:b/>
                 <w:bCs/>
-                <w:color w:val="4B5563"/>
+                <w:color w:val="5C5C5A"/>
                 <w:spacing w:val="20"/>
                 <w:sz w:val="15"/>
                 <w:szCs w:val="15"/>
@@ -126,7 +180,7 @@
                 <w:rFonts w:ascii="Calibri" w:cs="Calibri" w:eastAsia="Calibri" w:hAnsi="Calibri"/>
                 <w:b/>
                 <w:bCs/>
-                <w:color w:val="1F2937"/>
+                <w:color w:val="1D1D1B"/>
                 <w:sz w:val="20"/>
                 <w:szCs w:val="20"/>
               </w:rPr>
@@ -137,7 +191,7 @@
         <w:tc>
           <w:tcPr>
             <w:tcW w:type="dxa" w:w="2520"/>
-            <w:shd w:fill="E7F5F2" w:color="auto" w:val="clear"/>
+            <w:shd w:fill="E8EEF7" w:color="auto" w:val="clear"/>
             <w:tcMar>
               <w:top w:type="dxa" w:w="140"/>
               <w:left w:type="dxa" w:w="200"/>
@@ -154,7 +208,7 @@
                 <w:rFonts w:ascii="Calibri" w:cs="Calibri" w:eastAsia="Calibri" w:hAnsi="Calibri"/>
                 <w:b/>
                 <w:bCs/>
-                <w:color w:val="4B5563"/>
+                <w:color w:val="5C5C5A"/>
                 <w:spacing w:val="20"/>
                 <w:sz w:val="15"/>
                 <w:szCs w:val="15"/>
@@ -168,7 +222,7 @@
                 <w:rFonts w:ascii="Calibri" w:cs="Calibri" w:eastAsia="Calibri" w:hAnsi="Calibri"/>
                 <w:b/>
                 <w:bCs/>
-                <w:color w:val="1F2937"/>
+                <w:color w:val="1D1D1B"/>
                 <w:sz w:val="20"/>
                 <w:szCs w:val="20"/>
               </w:rPr>
@@ -179,7 +233,7 @@
         <w:tc>
           <w:tcPr>
             <w:tcW w:type="dxa" w:w="2520"/>
-            <w:shd w:fill="E7F5F2" w:color="auto" w:val="clear"/>
+            <w:shd w:fill="E8EEF7" w:color="auto" w:val="clear"/>
             <w:tcMar>
               <w:top w:type="dxa" w:w="140"/>
               <w:left w:type="dxa" w:w="200"/>
@@ -196,7 +250,7 @@
                 <w:rFonts w:ascii="Calibri" w:cs="Calibri" w:eastAsia="Calibri" w:hAnsi="Calibri"/>
                 <w:b/>
                 <w:bCs/>
-                <w:color w:val="4B5563"/>
+                <w:color w:val="5C5C5A"/>
                 <w:spacing w:val="20"/>
                 <w:sz w:val="15"/>
                 <w:szCs w:val="15"/>
@@ -210,7 +264,7 @@
                 <w:rFonts w:ascii="Calibri" w:cs="Calibri" w:eastAsia="Calibri" w:hAnsi="Calibri"/>
                 <w:b/>
                 <w:bCs/>
-                <w:color w:val="1F2937"/>
+                <w:color w:val="1D1D1B"/>
                 <w:sz w:val="20"/>
                 <w:szCs w:val="20"/>
               </w:rPr>
@@ -221,7 +275,7 @@
         <w:tc>
           <w:tcPr>
             <w:tcW w:type="dxa" w:w="2520"/>
-            <w:shd w:fill="E7F5F2" w:color="auto" w:val="clear"/>
+            <w:shd w:fill="E8EEF7" w:color="auto" w:val="clear"/>
             <w:tcMar>
               <w:top w:type="dxa" w:w="140"/>
               <w:left w:type="dxa" w:w="200"/>
@@ -238,7 +292,7 @@
                 <w:rFonts w:ascii="Calibri" w:cs="Calibri" w:eastAsia="Calibri" w:hAnsi="Calibri"/>
                 <w:b/>
                 <w:bCs/>
-                <w:color w:val="4B5563"/>
+                <w:color w:val="5C5C5A"/>
                 <w:spacing w:val="20"/>
                 <w:sz w:val="15"/>
                 <w:szCs w:val="15"/>
@@ -252,7 +306,7 @@
                 <w:rFonts w:ascii="Calibri" w:cs="Calibri" w:eastAsia="Calibri" w:hAnsi="Calibri"/>
                 <w:b/>
                 <w:bCs/>
-                <w:color w:val="1F2937"/>
+                <w:color w:val="1D1D1B"/>
                 <w:sz w:val="20"/>
                 <w:szCs w:val="20"/>
               </w:rPr>
@@ -272,7 +326,7 @@
         <w:pStyle w:val="Heading1"/>
         <w:keepNext/>
         <w:pBdr>
-          <w:bottom w:val="single" w:color="0F766E" w:sz="8" w:space="4"/>
+          <w:bottom w:val="single" w:color="0A4A92" w:sz="18" w:space="4"/>
         </w:pBdr>
         <w:spacing w:after="160" w:before="360"/>
       </w:pPr>
@@ -281,11 +335,11 @@
           <w:rFonts w:ascii="Calibri" w:cs="Calibri" w:eastAsia="Calibri" w:hAnsi="Calibri"/>
           <w:b/>
           <w:bCs/>
-          <w:color w:val="0F766E"/>
-          <w:sz w:val="30"/>
-          <w:szCs w:val="30"/>
-        </w:rPr>
-        <w:t xml:space="preserve">¿Qué lograrás?</w:t>
+          <w:color w:val="1D1D1B"/>
+          <w:sz w:val="28"/>
+          <w:szCs w:val="28"/>
+        </w:rPr>
+        <w:t xml:space="preserve">¿QUÉ LOGRARÁS?</w:t>
       </w:r>
     </w:p>
     <w:tbl>
@@ -310,11 +364,11 @@
             <w:tcW w:type="dxa" w:w="10080"/>
             <w:tcBorders>
               <w:top w:val="none" w:color="FFFFFF" w:sz="0"/>
-              <w:left w:val="single" w:color="0F766E" w:sz="24"/>
+              <w:left w:val="single" w:color="0A4A92" w:sz="24"/>
               <w:bottom w:val="none" w:color="FFFFFF" w:sz="0"/>
               <w:right w:val="none" w:color="FFFFFF" w:sz="0"/>
             </w:tcBorders>
-            <w:shd w:fill="E7F5F2" w:color="auto" w:val="clear"/>
+            <w:shd w:fill="E8EEF7" w:color="auto" w:val="clear"/>
             <w:tcMar>
               <w:top w:type="dxa" w:w="160"/>
               <w:left w:type="dxa" w:w="240"/>
@@ -331,7 +385,7 @@
                 <w:rFonts w:ascii="Calibri" w:cs="Calibri" w:eastAsia="Calibri" w:hAnsi="Calibri"/>
                 <w:b/>
                 <w:bCs/>
-                <w:color w:val="0F766E"/>
+                <w:color w:val="0A4A92"/>
                 <w:spacing w:val="20"/>
                 <w:sz w:val="17"/>
                 <w:szCs w:val="17"/>
@@ -346,7 +400,7 @@
             <w:r>
               <w:rPr>
                 <w:rFonts w:ascii="Calibri" w:cs="Calibri" w:eastAsia="Calibri" w:hAnsi="Calibri"/>
-                <w:color w:val="1F2937"/>
+                <w:color w:val="1D1D1B"/>
                 <w:sz w:val="23"/>
                 <w:szCs w:val="23"/>
               </w:rPr>
@@ -366,7 +420,7 @@
         <w:pStyle w:val="Heading1"/>
         <w:keepNext/>
         <w:pBdr>
-          <w:bottom w:val="single" w:color="0F766E" w:sz="8" w:space="4"/>
+          <w:bottom w:val="single" w:color="0A4A92" w:sz="18" w:space="4"/>
         </w:pBdr>
         <w:spacing w:after="160" w:before="360"/>
       </w:pPr>
@@ -375,11 +429,11 @@
           <w:rFonts w:ascii="Calibri" w:cs="Calibri" w:eastAsia="Calibri" w:hAnsi="Calibri"/>
           <w:b/>
           <w:bCs/>
-          <w:color w:val="0F766E"/>
-          <w:sz w:val="30"/>
-          <w:szCs w:val="30"/>
-        </w:rPr>
-        <w:t xml:space="preserve">Para empezar</w:t>
+          <w:color w:val="1D1D1B"/>
+          <w:sz w:val="28"/>
+          <w:szCs w:val="28"/>
+        </w:rPr>
+        <w:t xml:space="preserve">PARA EMPEZAR</w:t>
       </w:r>
     </w:p>
     <w:p>
@@ -389,7 +443,7 @@
       <w:r>
         <w:rPr>
           <w:rFonts w:ascii="Calibri" w:cs="Calibri" w:eastAsia="Calibri" w:hAnsi="Calibri"/>
-          <w:color w:val="1F2937"/>
+          <w:color w:val="1D1D1B"/>
           <w:sz w:val="22"/>
           <w:szCs w:val="22"/>
         </w:rPr>
@@ -403,7 +457,7 @@
       <w:r>
         <w:rPr>
           <w:rFonts w:ascii="Calibri" w:cs="Calibri" w:eastAsia="Calibri" w:hAnsi="Calibri"/>
-          <w:color w:val="1F2937"/>
+          <w:color w:val="1D1D1B"/>
           <w:sz w:val="22"/>
           <w:szCs w:val="22"/>
         </w:rPr>
@@ -421,7 +475,7 @@
           <w:rFonts w:ascii="Calibri" w:cs="Calibri" w:eastAsia="Calibri" w:hAnsi="Calibri"/>
           <w:b/>
           <w:bCs/>
-          <w:color w:val="1F2937"/>
+          <w:color w:val="1D1D1B"/>
           <w:sz w:val="23"/>
           <w:szCs w:val="23"/>
         </w:rPr>
@@ -440,7 +494,7 @@
       <w:r>
         <w:rPr>
           <w:rFonts w:ascii="Calibri" w:cs="Calibri" w:eastAsia="Calibri" w:hAnsi="Calibri"/>
-          <w:color w:val="1F2937"/>
+          <w:color w:val="1D1D1B"/>
           <w:sz w:val="22"/>
           <w:szCs w:val="22"/>
         </w:rPr>
@@ -459,7 +513,7 @@
       <w:r>
         <w:rPr>
           <w:rFonts w:ascii="Calibri" w:cs="Calibri" w:eastAsia="Calibri" w:hAnsi="Calibri"/>
-          <w:color w:val="1F2937"/>
+          <w:color w:val="1D1D1B"/>
           <w:sz w:val="22"/>
           <w:szCs w:val="22"/>
         </w:rPr>
@@ -478,7 +532,7 @@
       <w:r>
         <w:rPr>
           <w:rFonts w:ascii="Calibri" w:cs="Calibri" w:eastAsia="Calibri" w:hAnsi="Calibri"/>
-          <w:color w:val="1F2937"/>
+          <w:color w:val="1D1D1B"/>
           <w:sz w:val="22"/>
           <w:szCs w:val="22"/>
         </w:rPr>
@@ -490,7 +544,7 @@
         <w:pStyle w:val="Heading1"/>
         <w:keepNext/>
         <w:pBdr>
-          <w:bottom w:val="single" w:color="0F766E" w:sz="8" w:space="4"/>
+          <w:bottom w:val="single" w:color="0A4A92" w:sz="18" w:space="4"/>
         </w:pBdr>
         <w:spacing w:after="160" w:before="360"/>
       </w:pPr>
@@ -499,11 +553,11 @@
           <w:rFonts w:ascii="Calibri" w:cs="Calibri" w:eastAsia="Calibri" w:hAnsi="Calibri"/>
           <w:b/>
           <w:bCs/>
-          <w:color w:val="0F766E"/>
-          <w:sz w:val="30"/>
-          <w:szCs w:val="30"/>
-        </w:rPr>
-        <w:t xml:space="preserve">Paso a paso</w:t>
+          <w:color w:val="1D1D1B"/>
+          <w:sz w:val="28"/>
+          <w:szCs w:val="28"/>
+        </w:rPr>
+        <w:t xml:space="preserve">PASO A PASO</w:t>
       </w:r>
     </w:p>
     <w:p>
@@ -511,9 +565,9 @@
         <w:pStyle w:val="Heading2"/>
         <w:keepNext/>
         <w:pBdr>
-          <w:left w:val="single" w:color="0F766E" w:sz="24" w:space="8"/>
+          <w:left w:val="single" w:color="0A4A92" w:sz="36" w:space="8"/>
         </w:pBdr>
-        <w:shd w:fill="E7F5F2" w:color="auto" w:val="clear"/>
+        <w:shd w:fill="E8EEF7" w:color="auto" w:val="clear"/>
         <w:spacing w:after="100" w:before="280"/>
         <w:ind w:left="160"/>
       </w:pPr>
@@ -522,7 +576,7 @@
           <w:rFonts w:ascii="Calibri" w:cs="Calibri" w:eastAsia="Calibri" w:hAnsi="Calibri"/>
           <w:b/>
           <w:bCs/>
-          <w:color w:val="0F766E"/>
+          <w:color w:val="0A4A92"/>
           <w:spacing w:val="20"/>
           <w:sz w:val="18"/>
           <w:szCs w:val="18"/>
@@ -540,7 +594,7 @@
           <w:rFonts w:ascii="Calibri" w:cs="Calibri" w:eastAsia="Calibri" w:hAnsi="Calibri"/>
           <w:b/>
           <w:bCs/>
-          <w:color w:val="1F2937"/>
+          <w:color w:val="1D1D1B"/>
           <w:sz w:val="24"/>
           <w:szCs w:val="24"/>
         </w:rPr>
@@ -559,7 +613,7 @@
       <w:r>
         <w:rPr>
           <w:rFonts w:ascii="Calibri" w:cs="Calibri" w:eastAsia="Calibri" w:hAnsi="Calibri"/>
-          <w:color w:val="1F2937"/>
+          <w:color w:val="1D1D1B"/>
           <w:sz w:val="22"/>
           <w:szCs w:val="22"/>
         </w:rPr>
@@ -578,7 +632,7 @@
       <w:r>
         <w:rPr>
           <w:rFonts w:ascii="Calibri" w:cs="Calibri" w:eastAsia="Calibri" w:hAnsi="Calibri"/>
-          <w:color w:val="1F2937"/>
+          <w:color w:val="1D1D1B"/>
           <w:sz w:val="22"/>
           <w:szCs w:val="22"/>
         </w:rPr>
@@ -590,9 +644,9 @@
         <w:pStyle w:val="Heading2"/>
         <w:keepNext/>
         <w:pBdr>
-          <w:left w:val="single" w:color="0F766E" w:sz="24" w:space="8"/>
+          <w:left w:val="single" w:color="0A4A92" w:sz="36" w:space="8"/>
         </w:pBdr>
-        <w:shd w:fill="E7F5F2" w:color="auto" w:val="clear"/>
+        <w:shd w:fill="E8EEF7" w:color="auto" w:val="clear"/>
         <w:spacing w:after="100" w:before="280"/>
         <w:ind w:left="160"/>
       </w:pPr>
@@ -601,7 +655,7 @@
           <w:rFonts w:ascii="Calibri" w:cs="Calibri" w:eastAsia="Calibri" w:hAnsi="Calibri"/>
           <w:b/>
           <w:bCs/>
-          <w:color w:val="0F766E"/>
+          <w:color w:val="0A4A92"/>
           <w:spacing w:val="20"/>
           <w:sz w:val="18"/>
           <w:szCs w:val="18"/>
@@ -619,7 +673,7 @@
           <w:rFonts w:ascii="Calibri" w:cs="Calibri" w:eastAsia="Calibri" w:hAnsi="Calibri"/>
           <w:b/>
           <w:bCs/>
-          <w:color w:val="1F2937"/>
+          <w:color w:val="1D1D1B"/>
           <w:sz w:val="24"/>
           <w:szCs w:val="24"/>
         </w:rPr>
@@ -638,7 +692,7 @@
       <w:r>
         <w:rPr>
           <w:rFonts w:ascii="Calibri" w:cs="Calibri" w:eastAsia="Calibri" w:hAnsi="Calibri"/>
-          <w:color w:val="1F2937"/>
+          <w:color w:val="1D1D1B"/>
           <w:sz w:val="22"/>
           <w:szCs w:val="22"/>
         </w:rPr>
@@ -657,7 +711,7 @@
       <w:r>
         <w:rPr>
           <w:rFonts w:ascii="Calibri" w:cs="Calibri" w:eastAsia="Calibri" w:hAnsi="Calibri"/>
-          <w:color w:val="1F2937"/>
+          <w:color w:val="1D1D1B"/>
           <w:sz w:val="22"/>
           <w:szCs w:val="22"/>
         </w:rPr>
@@ -686,11 +740,11 @@
             <w:tcW w:type="dxa" w:w="10080"/>
             <w:tcBorders>
               <w:top w:val="none" w:color="FFFFFF" w:sz="0"/>
-              <w:left w:val="single" w:color="B45309" w:sz="24"/>
+              <w:left w:val="single" w:color="EF7D00" w:sz="24"/>
               <w:bottom w:val="none" w:color="FFFFFF" w:sz="0"/>
               <w:right w:val="none" w:color="FFFFFF" w:sz="0"/>
             </w:tcBorders>
-            <w:shd w:fill="FEF6E4" w:color="auto" w:val="clear"/>
+            <w:shd w:fill="FFF4DC" w:color="auto" w:val="clear"/>
             <w:tcMar>
               <w:top w:type="dxa" w:w="160"/>
               <w:left w:type="dxa" w:w="240"/>
@@ -707,7 +761,7 @@
                 <w:rFonts w:ascii="Calibri" w:cs="Calibri" w:eastAsia="Calibri" w:hAnsi="Calibri"/>
                 <w:b/>
                 <w:bCs/>
-                <w:color w:val="B45309"/>
+                <w:color w:val="8A5A00"/>
                 <w:spacing w:val="20"/>
                 <w:sz w:val="17"/>
                 <w:szCs w:val="17"/>
@@ -722,7 +776,7 @@
             <w:r>
               <w:rPr>
                 <w:rFonts w:ascii="Calibri" w:cs="Calibri" w:eastAsia="Calibri" w:hAnsi="Calibri"/>
-                <w:color w:val="1F2937"/>
+                <w:color w:val="1D1D1B"/>
                 <w:sz w:val="22"/>
                 <w:szCs w:val="22"/>
               </w:rPr>
@@ -742,9 +796,9 @@
         <w:pStyle w:val="Heading2"/>
         <w:keepNext/>
         <w:pBdr>
-          <w:left w:val="single" w:color="0F766E" w:sz="24" w:space="8"/>
+          <w:left w:val="single" w:color="0A4A92" w:sz="36" w:space="8"/>
         </w:pBdr>
-        <w:shd w:fill="E7F5F2" w:color="auto" w:val="clear"/>
+        <w:shd w:fill="E8EEF7" w:color="auto" w:val="clear"/>
         <w:spacing w:after="100" w:before="280"/>
         <w:ind w:left="160"/>
       </w:pPr>
@@ -753,7 +807,7 @@
           <w:rFonts w:ascii="Calibri" w:cs="Calibri" w:eastAsia="Calibri" w:hAnsi="Calibri"/>
           <w:b/>
           <w:bCs/>
-          <w:color w:val="0F766E"/>
+          <w:color w:val="0A4A92"/>
           <w:spacing w:val="20"/>
           <w:sz w:val="18"/>
           <w:szCs w:val="18"/>
@@ -771,7 +825,7 @@
           <w:rFonts w:ascii="Calibri" w:cs="Calibri" w:eastAsia="Calibri" w:hAnsi="Calibri"/>
           <w:b/>
           <w:bCs/>
-          <w:color w:val="1F2937"/>
+          <w:color w:val="1D1D1B"/>
           <w:sz w:val="24"/>
           <w:szCs w:val="24"/>
         </w:rPr>
@@ -790,7 +844,7 @@
       <w:r>
         <w:rPr>
           <w:rFonts w:ascii="Calibri" w:cs="Calibri" w:eastAsia="Calibri" w:hAnsi="Calibri"/>
-          <w:color w:val="1F2937"/>
+          <w:color w:val="1D1D1B"/>
           <w:sz w:val="22"/>
           <w:szCs w:val="22"/>
         </w:rPr>
@@ -809,7 +863,7 @@
       <w:r>
         <w:rPr>
           <w:rFonts w:ascii="Calibri" w:cs="Calibri" w:eastAsia="Calibri" w:hAnsi="Calibri"/>
-          <w:color w:val="1F2937"/>
+          <w:color w:val="1D1D1B"/>
           <w:sz w:val="22"/>
           <w:szCs w:val="22"/>
         </w:rPr>
@@ -828,7 +882,7 @@
       <w:r>
         <w:rPr>
           <w:rFonts w:ascii="Calibri" w:cs="Calibri" w:eastAsia="Calibri" w:hAnsi="Calibri"/>
-          <w:color w:val="1F2937"/>
+          <w:color w:val="1D1D1B"/>
           <w:sz w:val="22"/>
           <w:szCs w:val="22"/>
         </w:rPr>
@@ -840,9 +894,9 @@
         <w:pStyle w:val="Heading2"/>
         <w:keepNext/>
         <w:pBdr>
-          <w:left w:val="single" w:color="0F766E" w:sz="24" w:space="8"/>
+          <w:left w:val="single" w:color="0A4A92" w:sz="36" w:space="8"/>
         </w:pBdr>
-        <w:shd w:fill="E7F5F2" w:color="auto" w:val="clear"/>
+        <w:shd w:fill="E8EEF7" w:color="auto" w:val="clear"/>
         <w:spacing w:after="100" w:before="280"/>
         <w:ind w:left="160"/>
       </w:pPr>
@@ -851,7 +905,7 @@
           <w:rFonts w:ascii="Calibri" w:cs="Calibri" w:eastAsia="Calibri" w:hAnsi="Calibri"/>
           <w:b/>
           <w:bCs/>
-          <w:color w:val="0F766E"/>
+          <w:color w:val="0A4A92"/>
           <w:spacing w:val="20"/>
           <w:sz w:val="18"/>
           <w:szCs w:val="18"/>
@@ -869,7 +923,7 @@
           <w:rFonts w:ascii="Calibri" w:cs="Calibri" w:eastAsia="Calibri" w:hAnsi="Calibri"/>
           <w:b/>
           <w:bCs/>
-          <w:color w:val="1F2937"/>
+          <w:color w:val="1D1D1B"/>
           <w:sz w:val="24"/>
           <w:szCs w:val="24"/>
         </w:rPr>
@@ -888,7 +942,7 @@
       <w:r>
         <w:rPr>
           <w:rFonts w:ascii="Calibri" w:cs="Calibri" w:eastAsia="Calibri" w:hAnsi="Calibri"/>
-          <w:color w:val="1F2937"/>
+          <w:color w:val="1D1D1B"/>
           <w:sz w:val="22"/>
           <w:szCs w:val="22"/>
         </w:rPr>
@@ -907,7 +961,7 @@
       <w:r>
         <w:rPr>
           <w:rFonts w:ascii="Calibri" w:cs="Calibri" w:eastAsia="Calibri" w:hAnsi="Calibri"/>
-          <w:color w:val="1F2937"/>
+          <w:color w:val="1D1D1B"/>
           <w:sz w:val="22"/>
           <w:szCs w:val="22"/>
         </w:rPr>
@@ -926,7 +980,7 @@
       <w:r>
         <w:rPr>
           <w:rFonts w:ascii="Calibri" w:cs="Calibri" w:eastAsia="Calibri" w:hAnsi="Calibri"/>
-          <w:color w:val="1F2937"/>
+          <w:color w:val="1D1D1B"/>
           <w:sz w:val="22"/>
           <w:szCs w:val="22"/>
         </w:rPr>
@@ -945,7 +999,7 @@
       <w:r>
         <w:rPr>
           <w:rFonts w:ascii="Calibri" w:cs="Calibri" w:eastAsia="Calibri" w:hAnsi="Calibri"/>
-          <w:color w:val="1F2937"/>
+          <w:color w:val="1D1D1B"/>
           <w:sz w:val="22"/>
           <w:szCs w:val="22"/>
         </w:rPr>
@@ -957,9 +1011,9 @@
         <w:pStyle w:val="Heading2"/>
         <w:keepNext/>
         <w:pBdr>
-          <w:left w:val="single" w:color="0F766E" w:sz="24" w:space="8"/>
+          <w:left w:val="single" w:color="0A4A92" w:sz="36" w:space="8"/>
         </w:pBdr>
-        <w:shd w:fill="E7F5F2" w:color="auto" w:val="clear"/>
+        <w:shd w:fill="E8EEF7" w:color="auto" w:val="clear"/>
         <w:spacing w:after="100" w:before="280"/>
         <w:ind w:left="160"/>
       </w:pPr>
@@ -968,7 +1022,7 @@
           <w:rFonts w:ascii="Calibri" w:cs="Calibri" w:eastAsia="Calibri" w:hAnsi="Calibri"/>
           <w:b/>
           <w:bCs/>
-          <w:color w:val="0F766E"/>
+          <w:color w:val="0A4A92"/>
           <w:spacing w:val="20"/>
           <w:sz w:val="18"/>
           <w:szCs w:val="18"/>
@@ -986,7 +1040,7 @@
           <w:rFonts w:ascii="Calibri" w:cs="Calibri" w:eastAsia="Calibri" w:hAnsi="Calibri"/>
           <w:b/>
           <w:bCs/>
-          <w:color w:val="1F2937"/>
+          <w:color w:val="1D1D1B"/>
           <w:sz w:val="24"/>
           <w:szCs w:val="24"/>
         </w:rPr>
@@ -1005,7 +1059,7 @@
       <w:r>
         <w:rPr>
           <w:rFonts w:ascii="Calibri" w:cs="Calibri" w:eastAsia="Calibri" w:hAnsi="Calibri"/>
-          <w:color w:val="1F2937"/>
+          <w:color w:val="1D1D1B"/>
           <w:sz w:val="22"/>
           <w:szCs w:val="22"/>
         </w:rPr>
@@ -1024,7 +1078,7 @@
       <w:r>
         <w:rPr>
           <w:rFonts w:ascii="Calibri" w:cs="Calibri" w:eastAsia="Calibri" w:hAnsi="Calibri"/>
-          <w:color w:val="1F2937"/>
+          <w:color w:val="1D1D1B"/>
           <w:sz w:val="22"/>
           <w:szCs w:val="22"/>
         </w:rPr>
@@ -1036,9 +1090,9 @@
         <w:pStyle w:val="Heading2"/>
         <w:keepNext/>
         <w:pBdr>
-          <w:left w:val="single" w:color="0F766E" w:sz="24" w:space="8"/>
+          <w:left w:val="single" w:color="0A4A92" w:sz="36" w:space="8"/>
         </w:pBdr>
-        <w:shd w:fill="E7F5F2" w:color="auto" w:val="clear"/>
+        <w:shd w:fill="E8EEF7" w:color="auto" w:val="clear"/>
         <w:spacing w:after="100" w:before="280"/>
         <w:ind w:left="160"/>
       </w:pPr>
@@ -1047,7 +1101,7 @@
           <w:rFonts w:ascii="Calibri" w:cs="Calibri" w:eastAsia="Calibri" w:hAnsi="Calibri"/>
           <w:b/>
           <w:bCs/>
-          <w:color w:val="0F766E"/>
+          <w:color w:val="0A4A92"/>
           <w:spacing w:val="20"/>
           <w:sz w:val="18"/>
           <w:szCs w:val="18"/>
@@ -1065,7 +1119,7 @@
           <w:rFonts w:ascii="Calibri" w:cs="Calibri" w:eastAsia="Calibri" w:hAnsi="Calibri"/>
           <w:b/>
           <w:bCs/>
-          <w:color w:val="1F2937"/>
+          <w:color w:val="1D1D1B"/>
           <w:sz w:val="24"/>
           <w:szCs w:val="24"/>
         </w:rPr>
@@ -1084,7 +1138,7 @@
       <w:r>
         <w:rPr>
           <w:rFonts w:ascii="Calibri" w:cs="Calibri" w:eastAsia="Calibri" w:hAnsi="Calibri"/>
-          <w:color w:val="1F2937"/>
+          <w:color w:val="1D1D1B"/>
           <w:sz w:val="22"/>
           <w:szCs w:val="22"/>
         </w:rPr>
@@ -1103,7 +1157,7 @@
       <w:r>
         <w:rPr>
           <w:rFonts w:ascii="Calibri" w:cs="Calibri" w:eastAsia="Calibri" w:hAnsi="Calibri"/>
-          <w:color w:val="1F2937"/>
+          <w:color w:val="1D1D1B"/>
           <w:sz w:val="22"/>
           <w:szCs w:val="22"/>
         </w:rPr>
@@ -1122,7 +1176,7 @@
       <w:r>
         <w:rPr>
           <w:rFonts w:ascii="Calibri" w:cs="Calibri" w:eastAsia="Calibri" w:hAnsi="Calibri"/>
-          <w:color w:val="1F2937"/>
+          <w:color w:val="1D1D1B"/>
           <w:sz w:val="22"/>
           <w:szCs w:val="22"/>
         </w:rPr>
@@ -1134,9 +1188,9 @@
         <w:pStyle w:val="Heading2"/>
         <w:keepNext/>
         <w:pBdr>
-          <w:left w:val="single" w:color="0F766E" w:sz="24" w:space="8"/>
+          <w:left w:val="single" w:color="0A4A92" w:sz="36" w:space="8"/>
         </w:pBdr>
-        <w:shd w:fill="E7F5F2" w:color="auto" w:val="clear"/>
+        <w:shd w:fill="E8EEF7" w:color="auto" w:val="clear"/>
         <w:spacing w:after="100" w:before="280"/>
         <w:ind w:left="160"/>
       </w:pPr>
@@ -1145,7 +1199,7 @@
           <w:rFonts w:ascii="Calibri" w:cs="Calibri" w:eastAsia="Calibri" w:hAnsi="Calibri"/>
           <w:b/>
           <w:bCs/>
-          <w:color w:val="0F766E"/>
+          <w:color w:val="0A4A92"/>
           <w:spacing w:val="20"/>
           <w:sz w:val="18"/>
           <w:szCs w:val="18"/>
@@ -1163,7 +1217,7 @@
           <w:rFonts w:ascii="Calibri" w:cs="Calibri" w:eastAsia="Calibri" w:hAnsi="Calibri"/>
           <w:b/>
           <w:bCs/>
-          <w:color w:val="1F2937"/>
+          <w:color w:val="1D1D1B"/>
           <w:sz w:val="24"/>
           <w:szCs w:val="24"/>
         </w:rPr>
@@ -1182,7 +1236,7 @@
       <w:r>
         <w:rPr>
           <w:rFonts w:ascii="Calibri" w:cs="Calibri" w:eastAsia="Calibri" w:hAnsi="Calibri"/>
-          <w:color w:val="1F2937"/>
+          <w:color w:val="1D1D1B"/>
           <w:sz w:val="22"/>
           <w:szCs w:val="22"/>
         </w:rPr>
@@ -1201,7 +1255,7 @@
       <w:r>
         <w:rPr>
           <w:rFonts w:ascii="Calibri" w:cs="Calibri" w:eastAsia="Calibri" w:hAnsi="Calibri"/>
-          <w:color w:val="1F2937"/>
+          <w:color w:val="1D1D1B"/>
           <w:sz w:val="22"/>
           <w:szCs w:val="22"/>
         </w:rPr>
@@ -1230,11 +1284,11 @@
             <w:tcW w:type="dxa" w:w="10080"/>
             <w:tcBorders>
               <w:top w:val="none" w:color="FFFFFF" w:sz="0"/>
-              <w:left w:val="single" w:color="B45309" w:sz="24"/>
+              <w:left w:val="single" w:color="EF7D00" w:sz="24"/>
               <w:bottom w:val="none" w:color="FFFFFF" w:sz="0"/>
               <w:right w:val="none" w:color="FFFFFF" w:sz="0"/>
             </w:tcBorders>
-            <w:shd w:fill="FEF6E4" w:color="auto" w:val="clear"/>
+            <w:shd w:fill="FFF4DC" w:color="auto" w:val="clear"/>
             <w:tcMar>
               <w:top w:type="dxa" w:w="160"/>
               <w:left w:type="dxa" w:w="240"/>
@@ -1251,7 +1305,7 @@
                 <w:rFonts w:ascii="Calibri" w:cs="Calibri" w:eastAsia="Calibri" w:hAnsi="Calibri"/>
                 <w:b/>
                 <w:bCs/>
-                <w:color w:val="B45309"/>
+                <w:color w:val="8A5A00"/>
                 <w:spacing w:val="20"/>
                 <w:sz w:val="17"/>
                 <w:szCs w:val="17"/>
@@ -1266,7 +1320,7 @@
             <w:r>
               <w:rPr>
                 <w:rFonts w:ascii="Calibri" w:cs="Calibri" w:eastAsia="Calibri" w:hAnsi="Calibri"/>
-                <w:color w:val="1F2937"/>
+                <w:color w:val="1D1D1B"/>
                 <w:sz w:val="22"/>
                 <w:szCs w:val="22"/>
               </w:rPr>
@@ -1286,7 +1340,7 @@
         <w:pStyle w:val="Heading1"/>
         <w:keepNext/>
         <w:pBdr>
-          <w:bottom w:val="single" w:color="0F766E" w:sz="8" w:space="4"/>
+          <w:bottom w:val="single" w:color="0A4A92" w:sz="18" w:space="4"/>
         </w:pBdr>
         <w:spacing w:after="160" w:before="360"/>
       </w:pPr>
@@ -1295,23 +1349,23 @@
           <w:rFonts w:ascii="Calibri" w:cs="Calibri" w:eastAsia="Calibri" w:hAnsi="Calibri"/>
           <w:b/>
           <w:bCs/>
-          <w:color w:val="0F766E"/>
-          <w:sz w:val="30"/>
-          <w:szCs w:val="30"/>
-        </w:rPr>
-        <w:t xml:space="preserve">Mapa rápido de la interfaz</w:t>
+          <w:color w:val="1D1D1B"/>
+          <w:sz w:val="28"/>
+          <w:szCs w:val="28"/>
+        </w:rPr>
+        <w:t xml:space="preserve">MAPA RÁPIDO DE LA INTERFAZ</w:t>
       </w:r>
     </w:p>
     <w:tbl>
       <w:tblPr>
         <w:tblW w:type="dxa" w:w="10080"/>
         <w:tblBorders>
-          <w:top w:val="single" w:color="E5E7EB" w:sz="4"/>
-          <w:left w:val="single" w:color="E5E7EB" w:sz="4"/>
-          <w:bottom w:val="single" w:color="E5E7EB" w:sz="4"/>
-          <w:right w:val="single" w:color="E5E7EB" w:sz="4"/>
-          <w:insideH w:val="single" w:color="E5E7EB" w:sz="4"/>
-          <w:insideV w:val="single" w:color="E5E7EB" w:sz="4"/>
+          <w:top w:val="single" w:color="E2E2DF" w:sz="4"/>
+          <w:left w:val="single" w:color="E2E2DF" w:sz="4"/>
+          <w:bottom w:val="single" w:color="E2E2DF" w:sz="4"/>
+          <w:right w:val="single" w:color="E2E2DF" w:sz="4"/>
+          <w:insideH w:val="single" w:color="E2E2DF" w:sz="4"/>
+          <w:insideV w:val="single" w:color="E2E2DF" w:sz="4"/>
         </w:tblBorders>
         <w:tblLayout w:type="fixed"/>
       </w:tblPr>
@@ -1327,7 +1381,7 @@
         <w:tc>
           <w:tcPr>
             <w:tcW w:type="dxa" w:w="3427"/>
-            <w:shd w:fill="0F766E" w:color="auto" w:val="clear"/>
+            <w:shd w:fill="0A4A92" w:color="auto" w:val="clear"/>
             <w:tcMar>
               <w:top w:type="dxa" w:w="100"/>
               <w:left w:type="dxa" w:w="140"/>
@@ -1355,7 +1409,7 @@
         <w:tc>
           <w:tcPr>
             <w:tcW w:type="dxa" w:w="3629"/>
-            <w:shd w:fill="0F766E" w:color="auto" w:val="clear"/>
+            <w:shd w:fill="0A4A92" w:color="auto" w:val="clear"/>
             <w:tcMar>
               <w:top w:type="dxa" w:w="100"/>
               <w:left w:type="dxa" w:w="140"/>
@@ -1383,7 +1437,7 @@
         <w:tc>
           <w:tcPr>
             <w:tcW w:type="dxa" w:w="3024"/>
-            <w:shd w:fill="0F766E" w:color="auto" w:val="clear"/>
+            <w:shd w:fill="0A4A92" w:color="auto" w:val="clear"/>
             <w:tcMar>
               <w:top w:type="dxa" w:w="100"/>
               <w:left w:type="dxa" w:w="140"/>
@@ -1433,7 +1487,7 @@
               <w:rPr>
                 <w:b/>
                 <w:bCs/>
-                <w:color w:val="1F2937"/>
+                <w:color w:val="1D1D1B"/>
                 <w:sz w:val="20"/>
                 <w:szCs w:val="20"/>
               </w:rPr>
@@ -1461,7 +1515,7 @@
               <w:rPr>
                 <w:b w:val="false"/>
                 <w:bCs w:val="false"/>
-                <w:color w:val="1F2937"/>
+                <w:color w:val="1D1D1B"/>
                 <w:sz w:val="20"/>
                 <w:szCs w:val="20"/>
               </w:rPr>
@@ -1489,7 +1543,7 @@
               <w:rPr>
                 <w:b w:val="false"/>
                 <w:bCs w:val="false"/>
-                <w:color w:val="1F2937"/>
+                <w:color w:val="1D1D1B"/>
                 <w:sz w:val="20"/>
                 <w:szCs w:val="20"/>
               </w:rPr>
@@ -1505,7 +1559,7 @@
         <w:tc>
           <w:tcPr>
             <w:tcW w:type="dxa" w:w="3427"/>
-            <w:shd w:fill="F9FAFB" w:color="auto" w:val="clear"/>
+            <w:shd w:fill="F4F4F2" w:color="auto" w:val="clear"/>
             <w:tcMar>
               <w:top w:type="dxa" w:w="100"/>
               <w:left w:type="dxa" w:w="140"/>
@@ -1522,7 +1576,7 @@
               <w:rPr>
                 <w:b/>
                 <w:bCs/>
-                <w:color w:val="1F2937"/>
+                <w:color w:val="1D1D1B"/>
                 <w:sz w:val="20"/>
                 <w:szCs w:val="20"/>
               </w:rPr>
@@ -1533,7 +1587,7 @@
         <w:tc>
           <w:tcPr>
             <w:tcW w:type="dxa" w:w="3629"/>
-            <w:shd w:fill="F9FAFB" w:color="auto" w:val="clear"/>
+            <w:shd w:fill="F4F4F2" w:color="auto" w:val="clear"/>
             <w:tcMar>
               <w:top w:type="dxa" w:w="100"/>
               <w:left w:type="dxa" w:w="140"/>
@@ -1550,7 +1604,7 @@
               <w:rPr>
                 <w:b w:val="false"/>
                 <w:bCs w:val="false"/>
-                <w:color w:val="1F2937"/>
+                <w:color w:val="1D1D1B"/>
                 <w:sz w:val="20"/>
                 <w:szCs w:val="20"/>
               </w:rPr>
@@ -1561,7 +1615,7 @@
         <w:tc>
           <w:tcPr>
             <w:tcW w:type="dxa" w:w="3024"/>
-            <w:shd w:fill="F9FAFB" w:color="auto" w:val="clear"/>
+            <w:shd w:fill="F4F4F2" w:color="auto" w:val="clear"/>
             <w:tcMar>
               <w:top w:type="dxa" w:w="100"/>
               <w:left w:type="dxa" w:w="140"/>
@@ -1578,7 +1632,7 @@
               <w:rPr>
                 <w:b w:val="false"/>
                 <w:bCs w:val="false"/>
-                <w:color w:val="1F2937"/>
+                <w:color w:val="1D1D1B"/>
                 <w:sz w:val="20"/>
                 <w:szCs w:val="20"/>
               </w:rPr>
@@ -1611,7 +1665,7 @@
               <w:rPr>
                 <w:b/>
                 <w:bCs/>
-                <w:color w:val="1F2937"/>
+                <w:color w:val="1D1D1B"/>
                 <w:sz w:val="20"/>
                 <w:szCs w:val="20"/>
               </w:rPr>
@@ -1639,7 +1693,7 @@
               <w:rPr>
                 <w:b w:val="false"/>
                 <w:bCs w:val="false"/>
-                <w:color w:val="1F2937"/>
+                <w:color w:val="1D1D1B"/>
                 <w:sz w:val="20"/>
                 <w:szCs w:val="20"/>
               </w:rPr>
@@ -1667,7 +1721,7 @@
               <w:rPr>
                 <w:b w:val="false"/>
                 <w:bCs w:val="false"/>
-                <w:color w:val="1F2937"/>
+                <w:color w:val="1D1D1B"/>
                 <w:sz w:val="20"/>
                 <w:szCs w:val="20"/>
               </w:rPr>
@@ -1683,7 +1737,7 @@
         <w:tc>
           <w:tcPr>
             <w:tcW w:type="dxa" w:w="3427"/>
-            <w:shd w:fill="F9FAFB" w:color="auto" w:val="clear"/>
+            <w:shd w:fill="F4F4F2" w:color="auto" w:val="clear"/>
             <w:tcMar>
               <w:top w:type="dxa" w:w="100"/>
               <w:left w:type="dxa" w:w="140"/>
@@ -1700,7 +1754,7 @@
               <w:rPr>
                 <w:b/>
                 <w:bCs/>
-                <w:color w:val="1F2937"/>
+                <w:color w:val="1D1D1B"/>
                 <w:sz w:val="20"/>
                 <w:szCs w:val="20"/>
               </w:rPr>
@@ -1711,7 +1765,7 @@
         <w:tc>
           <w:tcPr>
             <w:tcW w:type="dxa" w:w="3629"/>
-            <w:shd w:fill="F9FAFB" w:color="auto" w:val="clear"/>
+            <w:shd w:fill="F4F4F2" w:color="auto" w:val="clear"/>
             <w:tcMar>
               <w:top w:type="dxa" w:w="100"/>
               <w:left w:type="dxa" w:w="140"/>
@@ -1728,7 +1782,7 @@
               <w:rPr>
                 <w:b w:val="false"/>
                 <w:bCs w:val="false"/>
-                <w:color w:val="1F2937"/>
+                <w:color w:val="1D1D1B"/>
                 <w:sz w:val="20"/>
                 <w:szCs w:val="20"/>
               </w:rPr>
@@ -1739,7 +1793,7 @@
         <w:tc>
           <w:tcPr>
             <w:tcW w:type="dxa" w:w="3024"/>
-            <w:shd w:fill="F9FAFB" w:color="auto" w:val="clear"/>
+            <w:shd w:fill="F4F4F2" w:color="auto" w:val="clear"/>
             <w:tcMar>
               <w:top w:type="dxa" w:w="100"/>
               <w:left w:type="dxa" w:w="140"/>
@@ -1756,7 +1810,7 @@
               <w:rPr>
                 <w:b w:val="false"/>
                 <w:bCs w:val="false"/>
-                <w:color w:val="1F2937"/>
+                <w:color w:val="1D1D1B"/>
                 <w:sz w:val="20"/>
                 <w:szCs w:val="20"/>
               </w:rPr>
@@ -1789,7 +1843,7 @@
               <w:rPr>
                 <w:b/>
                 <w:bCs/>
-                <w:color w:val="1F2937"/>
+                <w:color w:val="1D1D1B"/>
                 <w:sz w:val="20"/>
                 <w:szCs w:val="20"/>
               </w:rPr>
@@ -1817,7 +1871,7 @@
               <w:rPr>
                 <w:b w:val="false"/>
                 <w:bCs w:val="false"/>
-                <w:color w:val="1F2937"/>
+                <w:color w:val="1D1D1B"/>
                 <w:sz w:val="20"/>
                 <w:szCs w:val="20"/>
               </w:rPr>
@@ -1845,7 +1899,7 @@
               <w:rPr>
                 <w:b w:val="false"/>
                 <w:bCs w:val="false"/>
-                <w:color w:val="1F2937"/>
+                <w:color w:val="1D1D1B"/>
                 <w:sz w:val="20"/>
                 <w:szCs w:val="20"/>
               </w:rPr>
@@ -1861,7 +1915,7 @@
         <w:tc>
           <w:tcPr>
             <w:tcW w:type="dxa" w:w="3427"/>
-            <w:shd w:fill="F9FAFB" w:color="auto" w:val="clear"/>
+            <w:shd w:fill="F4F4F2" w:color="auto" w:val="clear"/>
             <w:tcMar>
               <w:top w:type="dxa" w:w="100"/>
               <w:left w:type="dxa" w:w="140"/>
@@ -1878,7 +1932,7 @@
               <w:rPr>
                 <w:b/>
                 <w:bCs/>
-                <w:color w:val="1F2937"/>
+                <w:color w:val="1D1D1B"/>
                 <w:sz w:val="20"/>
                 <w:szCs w:val="20"/>
               </w:rPr>
@@ -1889,7 +1943,7 @@
         <w:tc>
           <w:tcPr>
             <w:tcW w:type="dxa" w:w="3629"/>
-            <w:shd w:fill="F9FAFB" w:color="auto" w:val="clear"/>
+            <w:shd w:fill="F4F4F2" w:color="auto" w:val="clear"/>
             <w:tcMar>
               <w:top w:type="dxa" w:w="100"/>
               <w:left w:type="dxa" w:w="140"/>
@@ -1906,7 +1960,7 @@
               <w:rPr>
                 <w:b w:val="false"/>
                 <w:bCs w:val="false"/>
-                <w:color w:val="1F2937"/>
+                <w:color w:val="1D1D1B"/>
                 <w:sz w:val="20"/>
                 <w:szCs w:val="20"/>
               </w:rPr>
@@ -1917,7 +1971,7 @@
         <w:tc>
           <w:tcPr>
             <w:tcW w:type="dxa" w:w="3024"/>
-            <w:shd w:fill="F9FAFB" w:color="auto" w:val="clear"/>
+            <w:shd w:fill="F4F4F2" w:color="auto" w:val="clear"/>
             <w:tcMar>
               <w:top w:type="dxa" w:w="100"/>
               <w:left w:type="dxa" w:w="140"/>
@@ -1934,7 +1988,7 @@
               <w:rPr>
                 <w:b w:val="false"/>
                 <w:bCs w:val="false"/>
-                <w:color w:val="1F2937"/>
+                <w:color w:val="1D1D1B"/>
                 <w:sz w:val="20"/>
                 <w:szCs w:val="20"/>
               </w:rPr>
@@ -1954,7 +2008,7 @@
         <w:pStyle w:val="Heading1"/>
         <w:keepNext/>
         <w:pBdr>
-          <w:bottom w:val="single" w:color="0F766E" w:sz="8" w:space="4"/>
+          <w:bottom w:val="single" w:color="0A4A92" w:sz="18" w:space="4"/>
         </w:pBdr>
         <w:spacing w:after="160" w:before="360"/>
       </w:pPr>
@@ -1963,11 +2017,11 @@
           <w:rFonts w:ascii="Calibri" w:cs="Calibri" w:eastAsia="Calibri" w:hAnsi="Calibri"/>
           <w:b/>
           <w:bCs/>
-          <w:color w:val="0F766E"/>
-          <w:sz w:val="30"/>
-          <w:szCs w:val="30"/>
-        </w:rPr>
-        <w:t xml:space="preserve">Buenas prácticas</w:t>
+          <w:color w:val="1D1D1B"/>
+          <w:sz w:val="28"/>
+          <w:szCs w:val="28"/>
+        </w:rPr>
+        <w:t xml:space="preserve">BUENAS PRÁCTICAS</w:t>
       </w:r>
     </w:p>
     <w:p>
@@ -1982,7 +2036,7 @@
       <w:r>
         <w:rPr>
           <w:rFonts w:ascii="Calibri" w:cs="Calibri" w:eastAsia="Calibri" w:hAnsi="Calibri"/>
-          <w:color w:val="1F2937"/>
+          <w:color w:val="1D1D1B"/>
           <w:sz w:val="22"/>
           <w:szCs w:val="22"/>
         </w:rPr>
@@ -2001,7 +2055,7 @@
       <w:r>
         <w:rPr>
           <w:rFonts w:ascii="Calibri" w:cs="Calibri" w:eastAsia="Calibri" w:hAnsi="Calibri"/>
-          <w:color w:val="1F2937"/>
+          <w:color w:val="1D1D1B"/>
           <w:sz w:val="22"/>
           <w:szCs w:val="22"/>
         </w:rPr>
@@ -2020,7 +2074,7 @@
       <w:r>
         <w:rPr>
           <w:rFonts w:ascii="Calibri" w:cs="Calibri" w:eastAsia="Calibri" w:hAnsi="Calibri"/>
-          <w:color w:val="1F2937"/>
+          <w:color w:val="1D1D1B"/>
           <w:sz w:val="22"/>
           <w:szCs w:val="22"/>
         </w:rPr>
@@ -2032,7 +2086,7 @@
         <w:pStyle w:val="Heading1"/>
         <w:keepNext/>
         <w:pBdr>
-          <w:bottom w:val="single" w:color="0F766E" w:sz="8" w:space="4"/>
+          <w:bottom w:val="single" w:color="0A4A92" w:sz="18" w:space="4"/>
         </w:pBdr>
         <w:spacing w:after="160" w:before="360"/>
       </w:pPr>
@@ -2041,23 +2095,23 @@
           <w:rFonts w:ascii="Calibri" w:cs="Calibri" w:eastAsia="Calibri" w:hAnsi="Calibri"/>
           <w:b/>
           <w:bCs/>
-          <w:color w:val="0F766E"/>
-          <w:sz w:val="30"/>
-          <w:szCs w:val="30"/>
-        </w:rPr>
-        <w:t xml:space="preserve">Errores frecuentes y cómo resolverlos</w:t>
+          <w:color w:val="1D1D1B"/>
+          <w:sz w:val="28"/>
+          <w:szCs w:val="28"/>
+        </w:rPr>
+        <w:t xml:space="preserve">ERRORES FRECUENTES Y CÓMO RESOLVERLOS</w:t>
       </w:r>
     </w:p>
     <w:tbl>
       <w:tblPr>
         <w:tblW w:type="dxa" w:w="10080"/>
         <w:tblBorders>
-          <w:top w:val="single" w:color="E5E7EB" w:sz="4"/>
-          <w:left w:val="single" w:color="E5E7EB" w:sz="4"/>
-          <w:bottom w:val="single" w:color="E5E7EB" w:sz="4"/>
-          <w:right w:val="single" w:color="E5E7EB" w:sz="4"/>
-          <w:insideH w:val="single" w:color="E5E7EB" w:sz="4"/>
-          <w:insideV w:val="single" w:color="E5E7EB" w:sz="4"/>
+          <w:top w:val="single" w:color="E2E2DF" w:sz="4"/>
+          <w:left w:val="single" w:color="E2E2DF" w:sz="4"/>
+          <w:bottom w:val="single" w:color="E2E2DF" w:sz="4"/>
+          <w:right w:val="single" w:color="E2E2DF" w:sz="4"/>
+          <w:insideH w:val="single" w:color="E2E2DF" w:sz="4"/>
+          <w:insideV w:val="single" w:color="E2E2DF" w:sz="4"/>
         </w:tblBorders>
         <w:tblLayout w:type="fixed"/>
       </w:tblPr>
@@ -2072,7 +2126,7 @@
         <w:tc>
           <w:tcPr>
             <w:tcW w:type="dxa" w:w="3629"/>
-            <w:shd w:fill="0F766E" w:color="auto" w:val="clear"/>
+            <w:shd w:fill="0A4A92" w:color="auto" w:val="clear"/>
             <w:tcMar>
               <w:top w:type="dxa" w:w="100"/>
               <w:left w:type="dxa" w:w="140"/>
@@ -2100,7 +2154,7 @@
         <w:tc>
           <w:tcPr>
             <w:tcW w:type="dxa" w:w="6451"/>
-            <w:shd w:fill="0F766E" w:color="auto" w:val="clear"/>
+            <w:shd w:fill="0A4A92" w:color="auto" w:val="clear"/>
             <w:tcMar>
               <w:top w:type="dxa" w:w="100"/>
               <w:left w:type="dxa" w:w="140"/>
@@ -2150,7 +2204,7 @@
               <w:rPr>
                 <w:b/>
                 <w:bCs/>
-                <w:color w:val="1F2937"/>
+                <w:color w:val="1D1D1B"/>
                 <w:sz w:val="20"/>
                 <w:szCs w:val="20"/>
               </w:rPr>
@@ -2178,7 +2232,7 @@
               <w:rPr>
                 <w:b w:val="false"/>
                 <w:bCs w:val="false"/>
-                <w:color w:val="1F2937"/>
+                <w:color w:val="1D1D1B"/>
                 <w:sz w:val="20"/>
                 <w:szCs w:val="20"/>
               </w:rPr>
@@ -2194,7 +2248,7 @@
         <w:tc>
           <w:tcPr>
             <w:tcW w:type="dxa" w:w="3629"/>
-            <w:shd w:fill="F9FAFB" w:color="auto" w:val="clear"/>
+            <w:shd w:fill="F4F4F2" w:color="auto" w:val="clear"/>
             <w:tcMar>
               <w:top w:type="dxa" w:w="100"/>
               <w:left w:type="dxa" w:w="140"/>
@@ -2211,7 +2265,7 @@
               <w:rPr>
                 <w:b/>
                 <w:bCs/>
-                <w:color w:val="1F2937"/>
+                <w:color w:val="1D1D1B"/>
                 <w:sz w:val="20"/>
                 <w:szCs w:val="20"/>
               </w:rPr>
@@ -2222,7 +2276,7 @@
         <w:tc>
           <w:tcPr>
             <w:tcW w:type="dxa" w:w="6451"/>
-            <w:shd w:fill="F9FAFB" w:color="auto" w:val="clear"/>
+            <w:shd w:fill="F4F4F2" w:color="auto" w:val="clear"/>
             <w:tcMar>
               <w:top w:type="dxa" w:w="100"/>
               <w:left w:type="dxa" w:w="140"/>
@@ -2239,7 +2293,7 @@
               <w:rPr>
                 <w:b w:val="false"/>
                 <w:bCs w:val="false"/>
-                <w:color w:val="1F2937"/>
+                <w:color w:val="1D1D1B"/>
                 <w:sz w:val="20"/>
                 <w:szCs w:val="20"/>
               </w:rPr>
@@ -2272,7 +2326,7 @@
               <w:rPr>
                 <w:b/>
                 <w:bCs/>
-                <w:color w:val="1F2937"/>
+                <w:color w:val="1D1D1B"/>
                 <w:sz w:val="20"/>
                 <w:szCs w:val="20"/>
               </w:rPr>
@@ -2300,7 +2354,7 @@
               <w:rPr>
                 <w:b w:val="false"/>
                 <w:bCs w:val="false"/>
-                <w:color w:val="1F2937"/>
+                <w:color w:val="1D1D1B"/>
                 <w:sz w:val="20"/>
                 <w:szCs w:val="20"/>
               </w:rPr>
@@ -2320,7 +2374,7 @@
         <w:pStyle w:val="Heading1"/>
         <w:keepNext/>
         <w:pBdr>
-          <w:bottom w:val="single" w:color="0F766E" w:sz="8" w:space="4"/>
+          <w:bottom w:val="single" w:color="0A4A92" w:sz="18" w:space="4"/>
         </w:pBdr>
         <w:spacing w:after="160" w:before="360"/>
       </w:pPr>
@@ -2329,11 +2383,11 @@
           <w:rFonts w:ascii="Calibri" w:cs="Calibri" w:eastAsia="Calibri" w:hAnsi="Calibri"/>
           <w:b/>
           <w:bCs/>
-          <w:color w:val="0F766E"/>
-          <w:sz w:val="30"/>
-          <w:szCs w:val="30"/>
-        </w:rPr>
-        <w:t xml:space="preserve">Reto práctico</w:t>
+          <w:color w:val="1D1D1B"/>
+          <w:sz w:val="28"/>
+          <w:szCs w:val="28"/>
+        </w:rPr>
+        <w:t xml:space="preserve">RETO PRÁCTICO</w:t>
       </w:r>
     </w:p>
     <w:tbl>
@@ -2358,11 +2412,11 @@
             <w:tcW w:type="dxa" w:w="10080"/>
             <w:tcBorders>
               <w:top w:val="none" w:color="FFFFFF" w:sz="0"/>
-              <w:left w:val="single" w:color="0F766E" w:sz="24"/>
+              <w:left w:val="single" w:color="1D1D1B" w:sz="24"/>
               <w:bottom w:val="none" w:color="FFFFFF" w:sz="0"/>
               <w:right w:val="none" w:color="FFFFFF" w:sz="0"/>
             </w:tcBorders>
-            <w:shd w:fill="E7F5F2" w:color="auto" w:val="clear"/>
+            <w:shd w:fill="F4F4F2" w:color="auto" w:val="clear"/>
             <w:tcMar>
               <w:top w:type="dxa" w:w="160"/>
               <w:left w:type="dxa" w:w="240"/>
@@ -2379,7 +2433,7 @@
                 <w:rFonts w:ascii="Calibri" w:cs="Calibri" w:eastAsia="Calibri" w:hAnsi="Calibri"/>
                 <w:b/>
                 <w:bCs/>
-                <w:color w:val="0F766E"/>
+                <w:color w:val="1D1D1B"/>
                 <w:spacing w:val="20"/>
                 <w:sz w:val="17"/>
                 <w:szCs w:val="17"/>
@@ -2394,7 +2448,7 @@
             <w:r>
               <w:rPr>
                 <w:rFonts w:ascii="Calibri" w:cs="Calibri" w:eastAsia="Calibri" w:hAnsi="Calibri"/>
-                <w:color w:val="1F2937"/>
+                <w:color w:val="1D1D1B"/>
                 <w:sz w:val="22"/>
                 <w:szCs w:val="22"/>
               </w:rPr>
@@ -2414,7 +2468,7 @@
         <w:pStyle w:val="Heading1"/>
         <w:keepNext/>
         <w:pBdr>
-          <w:bottom w:val="single" w:color="0F766E" w:sz="8" w:space="4"/>
+          <w:bottom w:val="single" w:color="0A4A92" w:sz="18" w:space="4"/>
         </w:pBdr>
         <w:spacing w:after="160" w:before="360"/>
       </w:pPr>
@@ -2423,11 +2477,11 @@
           <w:rFonts w:ascii="Calibri" w:cs="Calibri" w:eastAsia="Calibri" w:hAnsi="Calibri"/>
           <w:b/>
           <w:bCs/>
-          <w:color w:val="0F766E"/>
-          <w:sz w:val="30"/>
-          <w:szCs w:val="30"/>
-        </w:rPr>
-        <w:t xml:space="preserve">Verifica tu avance</w:t>
+          <w:color w:val="1D1D1B"/>
+          <w:sz w:val="28"/>
+          <w:szCs w:val="28"/>
+        </w:rPr>
+        <w:t xml:space="preserve">VERIFICA TU AVANCE</w:t>
       </w:r>
     </w:p>
     <w:p>
@@ -2441,7 +2495,7 @@
       <w:r>
         <w:rPr>
           <w:rFonts w:ascii="Segoe UI Symbol" w:cs="Segoe UI Symbol" w:eastAsia="Segoe UI Symbol" w:hAnsi="Segoe UI Symbol"/>
-          <w:color w:val="4B5563"/>
+          <w:color w:val="5C5C5A"/>
           <w:sz w:val="26"/>
           <w:szCs w:val="26"/>
         </w:rPr>
@@ -2450,7 +2504,7 @@
       <w:r>
         <w:rPr>
           <w:rFonts w:ascii="Calibri" w:cs="Calibri" w:eastAsia="Calibri" w:hAnsi="Calibri"/>
-          <w:color w:val="1F2937"/>
+          <w:color w:val="1D1D1B"/>
           <w:sz w:val="22"/>
           <w:szCs w:val="22"/>
         </w:rPr>
@@ -2468,7 +2522,7 @@
       <w:r>
         <w:rPr>
           <w:rFonts w:ascii="Segoe UI Symbol" w:cs="Segoe UI Symbol" w:eastAsia="Segoe UI Symbol" w:hAnsi="Segoe UI Symbol"/>
-          <w:color w:val="4B5563"/>
+          <w:color w:val="5C5C5A"/>
           <w:sz w:val="26"/>
           <w:szCs w:val="26"/>
         </w:rPr>
@@ -2477,7 +2531,7 @@
       <w:r>
         <w:rPr>
           <w:rFonts w:ascii="Calibri" w:cs="Calibri" w:eastAsia="Calibri" w:hAnsi="Calibri"/>
-          <w:color w:val="1F2937"/>
+          <w:color w:val="1D1D1B"/>
           <w:sz w:val="22"/>
           <w:szCs w:val="22"/>
         </w:rPr>
@@ -2495,7 +2549,7 @@
       <w:r>
         <w:rPr>
           <w:rFonts w:ascii="Segoe UI Symbol" w:cs="Segoe UI Symbol" w:eastAsia="Segoe UI Symbol" w:hAnsi="Segoe UI Symbol"/>
-          <w:color w:val="4B5563"/>
+          <w:color w:val="5C5C5A"/>
           <w:sz w:val="26"/>
           <w:szCs w:val="26"/>
         </w:rPr>
@@ -2504,7 +2558,7 @@
       <w:r>
         <w:rPr>
           <w:rFonts w:ascii="Calibri" w:cs="Calibri" w:eastAsia="Calibri" w:hAnsi="Calibri"/>
-          <w:color w:val="1F2937"/>
+          <w:color w:val="1D1D1B"/>
           <w:sz w:val="22"/>
           <w:szCs w:val="22"/>
         </w:rPr>
@@ -2522,7 +2576,7 @@
       <w:r>
         <w:rPr>
           <w:rFonts w:ascii="Segoe UI Symbol" w:cs="Segoe UI Symbol" w:eastAsia="Segoe UI Symbol" w:hAnsi="Segoe UI Symbol"/>
-          <w:color w:val="4B5563"/>
+          <w:color w:val="5C5C5A"/>
           <w:sz w:val="26"/>
           <w:szCs w:val="26"/>
         </w:rPr>
@@ -2531,7 +2585,7 @@
       <w:r>
         <w:rPr>
           <w:rFonts w:ascii="Calibri" w:cs="Calibri" w:eastAsia="Calibri" w:hAnsi="Calibri"/>
-          <w:color w:val="1F2937"/>
+          <w:color w:val="1D1D1B"/>
           <w:sz w:val="22"/>
           <w:szCs w:val="22"/>
         </w:rPr>
@@ -2565,11 +2619,11 @@
             <w:tcW w:type="dxa" w:w="10080"/>
             <w:tcBorders>
               <w:top w:val="none" w:color="FFFFFF" w:sz="0"/>
-              <w:left w:val="none" w:color="FFFFFF" w:sz="0"/>
+              <w:left w:val="single" w:color="EF7D00" w:sz="24"/>
               <w:bottom w:val="none" w:color="FFFFFF" w:sz="0"/>
               <w:right w:val="none" w:color="FFFFFF" w:sz="0"/>
             </w:tcBorders>
-            <w:shd w:fill="1F2937" w:color="auto" w:val="clear"/>
+            <w:shd w:fill="1D1D1B" w:color="auto" w:val="clear"/>
             <w:tcMar>
               <w:top w:type="dxa" w:w="240"/>
               <w:left w:type="dxa" w:w="300"/>
@@ -2586,7 +2640,7 @@
                 <w:rFonts w:ascii="Calibri" w:cs="Calibri" w:eastAsia="Calibri" w:hAnsi="Calibri"/>
                 <w:b/>
                 <w:bCs/>
-                <w:color w:val="FFFFFF"/>
+                <w:color w:val="EF7D00"/>
                 <w:sz w:val="24"/>
                 <w:szCs w:val="24"/>
               </w:rPr>
@@ -2681,7 +2735,7 @@
     <w:r>
       <w:rPr>
         <w:rFonts w:ascii="Calibri" w:cs="Calibri" w:eastAsia="Calibri" w:hAnsi="Calibri"/>
-        <w:color w:val="4B5563"/>
+        <w:color w:val="5C5C5A"/>
         <w:sz w:val="16"/>
         <w:szCs w:val="16"/>
       </w:rPr>
@@ -2690,7 +2744,7 @@
     <w:r>
       <w:rPr>
         <w:rFonts w:ascii="Calibri" w:cs="Calibri" w:eastAsia="Calibri" w:hAnsi="Calibri"/>
-        <w:color w:val="4B5563"/>
+        <w:color w:val="5C5C5A"/>
         <w:sz w:val="16"/>
         <w:szCs w:val="16"/>
       </w:rPr>
@@ -2699,7 +2753,7 @@
     <w:r>
       <w:rPr>
         <w:rFonts w:ascii="Calibri" w:cs="Calibri" w:eastAsia="Calibri" w:hAnsi="Calibri"/>
-        <w:color w:val="4B5563"/>
+        <w:color w:val="5C5C5A"/>
         <w:sz w:val="16"/>
         <w:szCs w:val="16"/>
       </w:rPr>
@@ -2711,7 +2765,7 @@
     <w:r>
       <w:rPr>
         <w:rFonts w:ascii="Calibri" w:cs="Calibri" w:eastAsia="Calibri" w:hAnsi="Calibri"/>
-        <w:color w:val="4B5563"/>
+        <w:color w:val="5C5C5A"/>
         <w:sz w:val="16"/>
         <w:szCs w:val="16"/>
       </w:rPr>
@@ -2720,7 +2774,7 @@
     <w:r>
       <w:rPr>
         <w:rFonts w:ascii="Calibri" w:cs="Calibri" w:eastAsia="Calibri" w:hAnsi="Calibri"/>
-        <w:color w:val="4B5563"/>
+        <w:color w:val="5C5C5A"/>
         <w:sz w:val="16"/>
         <w:szCs w:val="16"/>
       </w:rPr>
@@ -2775,7 +2829,7 @@
   <w:p>
     <w:pPr>
       <w:pBdr>
-        <w:bottom w:val="single" w:color="E5E7EB" w:sz="4" w:space="6"/>
+        <w:bottom w:val="single" w:color="E2E2DF" w:sz="4" w:space="6"/>
       </w:pBdr>
       <w:tabs>
         <w:tab w:val="right" w:pos="10080"/>
@@ -2786,7 +2840,7 @@
         <w:rFonts w:ascii="Calibri" w:cs="Calibri" w:eastAsia="Calibri" w:hAnsi="Calibri"/>
         <w:b/>
         <w:bCs/>
-        <w:color w:val="EF6C00"/>
+        <w:color w:val="A65200"/>
         <w:sz w:val="17"/>
         <w:szCs w:val="17"/>
       </w:rPr>
@@ -2795,7 +2849,7 @@
     <w:r>
       <w:rPr>
         <w:rFonts w:ascii="Calibri" w:cs="Calibri" w:eastAsia="Calibri" w:hAnsi="Calibri"/>
-        <w:color w:val="4B5563"/>
+        <w:color w:val="5C5C5A"/>
         <w:sz w:val="17"/>
         <w:szCs w:val="17"/>
       </w:rPr>
@@ -2806,7 +2860,7 @@
         <w:rFonts w:ascii="Calibri" w:cs="Calibri" w:eastAsia="Calibri" w:hAnsi="Calibri"/>
         <w:b/>
         <w:bCs/>
-        <w:color w:val="0F766E"/>
+        <w:color w:val="0A4A92"/>
         <w:sz w:val="17"/>
         <w:szCs w:val="17"/>
       </w:rPr>
@@ -2915,7 +2969,7 @@
       <w:rPr>
         <w:b/>
         <w:bCs/>
-        <w:color w:val="0F766E"/>
+        <w:color w:val="EF7D00"/>
       </w:rPr>
     </w:lvl>
   </w:abstractNum>
@@ -2940,7 +2994,7 @@
     <w:rPrDefault>
       <w:rPr>
         <w:rFonts w:ascii="Calibri" w:cs="Calibri" w:eastAsia="Calibri" w:hAnsi="Calibri"/>
-        <w:color w:val="1F2937"/>
+        <w:color w:val="1D1D1B"/>
         <w:sz w:val="22"/>
         <w:szCs w:val="22"/>
       </w:rPr>
@@ -3120,9 +3174,9 @@
       <w:rFonts w:ascii="Calibri" w:cs="Calibri" w:eastAsia="Calibri" w:hAnsi="Calibri"/>
       <w:b/>
       <w:bCs/>
-      <w:color w:val="0F766E"/>
-      <w:sz w:val="30"/>
-      <w:szCs w:val="30"/>
+      <w:color w:val="1D1D1B"/>
+      <w:sz w:val="28"/>
+      <w:szCs w:val="28"/>
     </w:rPr>
   </w:style>
   <w:style w:type="paragraph" w:styleId="Heading2">
@@ -3137,7 +3191,7 @@
       <w:rFonts w:ascii="Calibri" w:cs="Calibri" w:eastAsia="Calibri" w:hAnsi="Calibri"/>
       <w:b/>
       <w:bCs/>
-      <w:color w:val="1F2937"/>
+      <w:color w:val="1D1D1B"/>
       <w:sz w:val="24"/>
       <w:szCs w:val="24"/>
     </w:rPr>
@@ -3154,7 +3208,7 @@
       <w:rFonts w:ascii="Calibri" w:cs="Calibri" w:eastAsia="Calibri" w:hAnsi="Calibri"/>
       <w:b/>
       <w:bCs/>
-      <w:color w:val="1F2937"/>
+      <w:color w:val="1D1D1B"/>
       <w:sz w:val="23"/>
       <w:szCs w:val="23"/>
     </w:rPr>

</xml_diff>

<commit_message>
Adapta la página al sistema de diseño del sitio del CEA
- Bandas de identidad nocturnas (encabezado, apertura, pie) con retícula
  y grano; lectura sobre papel, menta y lavanda.
- Manrope + Source Sans 3, acentos de título en turquesa con subrayado
  naranja, rótulos en Chakra Petch.
- Rutas con los colores de las cuatro áreas, solo en piezas y bordes.
- Botones en cápsula, tarjetas de 14 px sin sombra, título primero.
- Vuelve la lectura oscura con los tokens del DESIGN.md.
- Logos en versión noche (provisionales) y PDF/Word regenerados.

Co-Authored-By: Claude Opus 5.5 <noreply@anthropic.com>
</commit_message>
<xml_diff>
--- a/word/Capsula_01_Conoce_tu_aula_virtual.docx
+++ b/word/Capsula_01_Conoce_tu_aula_virtual.docx
@@ -74,7 +74,7 @@
               <w:bottom w:val="none" w:color="FFFFFF" w:sz="0"/>
               <w:right w:val="none" w:color="FFFFFF" w:sz="0"/>
             </w:tcBorders>
-            <w:shd w:fill="0A4A92" w:color="auto" w:val="clear"/>
+            <w:shd w:fill="0D2227" w:color="auto" w:val="clear"/>
             <w:tcMar>
               <w:top w:type="dxa" w:w="360"/>
               <w:left w:type="dxa" w:w="360"/>
@@ -91,7 +91,7 @@
                 <w:rFonts w:ascii="Calibri" w:cs="Calibri" w:eastAsia="Calibri" w:hAnsi="Calibri"/>
                 <w:b/>
                 <w:bCs/>
-                <w:color w:val="FFFFFF"/>
+                <w:color w:val="B4C4C6"/>
                 <w:spacing w:val="30"/>
                 <w:sz w:val="18"/>
                 <w:szCs w:val="18"/>
@@ -106,9 +106,7 @@
             <w:r>
               <w:rPr>
                 <w:rFonts w:ascii="Calibri" w:cs="Calibri" w:eastAsia="Calibri" w:hAnsi="Calibri"/>
-                <w:b/>
-                <w:bCs/>
-                <w:color w:val="FFFFFF"/>
+                <w:color w:val="FAFBF7"/>
                 <w:sz w:val="48"/>
                 <w:szCs w:val="48"/>
               </w:rPr>
@@ -121,7 +119,7 @@
     <w:p>
       <w:pPr>
         <w:pBdr>
-          <w:top w:val="single" w:color="EF7D00" w:sz="36" w:space="0"/>
+          <w:top w:val="single" w:color="1399B0" w:sz="36" w:space="0"/>
         </w:pBdr>
         <w:spacing w:after="0"/>
       </w:pPr>
@@ -135,7 +133,7 @@
           <w:bottom w:val="none" w:color="FFFFFF" w:sz="0"/>
           <w:right w:val="none" w:color="FFFFFF" w:sz="0"/>
           <w:insideH w:val="none" w:color="FFFFFF" w:sz="0"/>
-          <w:insideV w:val="single" w:color="E2E2DF" w:sz="4"/>
+          <w:insideV w:val="single" w:color="CAD6D0" w:sz="4"/>
         </w:tblBorders>
         <w:tblLayout w:type="fixed"/>
       </w:tblPr>
@@ -149,7 +147,7 @@
         <w:tc>
           <w:tcPr>
             <w:tcW w:type="dxa" w:w="2520"/>
-            <w:shd w:fill="E8EEF7" w:color="auto" w:val="clear"/>
+            <w:shd w:fill="E8F2E9" w:color="auto" w:val="clear"/>
             <w:tcMar>
               <w:top w:type="dxa" w:w="140"/>
               <w:left w:type="dxa" w:w="200"/>
@@ -166,7 +164,7 @@
                 <w:rFonts w:ascii="Calibri" w:cs="Calibri" w:eastAsia="Calibri" w:hAnsi="Calibri"/>
                 <w:b/>
                 <w:bCs/>
-                <w:color w:val="5C5C5A"/>
+                <w:color w:val="52656A"/>
                 <w:spacing w:val="20"/>
                 <w:sz w:val="15"/>
                 <w:szCs w:val="15"/>
@@ -180,7 +178,7 @@
                 <w:rFonts w:ascii="Calibri" w:cs="Calibri" w:eastAsia="Calibri" w:hAnsi="Calibri"/>
                 <w:b/>
                 <w:bCs/>
-                <w:color w:val="1D1D1B"/>
+                <w:color w:val="183A43"/>
                 <w:sz w:val="20"/>
                 <w:szCs w:val="20"/>
               </w:rPr>
@@ -191,7 +189,7 @@
         <w:tc>
           <w:tcPr>
             <w:tcW w:type="dxa" w:w="2520"/>
-            <w:shd w:fill="E8EEF7" w:color="auto" w:val="clear"/>
+            <w:shd w:fill="E8F2E9" w:color="auto" w:val="clear"/>
             <w:tcMar>
               <w:top w:type="dxa" w:w="140"/>
               <w:left w:type="dxa" w:w="200"/>
@@ -208,7 +206,7 @@
                 <w:rFonts w:ascii="Calibri" w:cs="Calibri" w:eastAsia="Calibri" w:hAnsi="Calibri"/>
                 <w:b/>
                 <w:bCs/>
-                <w:color w:val="5C5C5A"/>
+                <w:color w:val="52656A"/>
                 <w:spacing w:val="20"/>
                 <w:sz w:val="15"/>
                 <w:szCs w:val="15"/>
@@ -222,7 +220,7 @@
                 <w:rFonts w:ascii="Calibri" w:cs="Calibri" w:eastAsia="Calibri" w:hAnsi="Calibri"/>
                 <w:b/>
                 <w:bCs/>
-                <w:color w:val="1D1D1B"/>
+                <w:color w:val="183A43"/>
                 <w:sz w:val="20"/>
                 <w:szCs w:val="20"/>
               </w:rPr>
@@ -233,7 +231,7 @@
         <w:tc>
           <w:tcPr>
             <w:tcW w:type="dxa" w:w="2520"/>
-            <w:shd w:fill="E8EEF7" w:color="auto" w:val="clear"/>
+            <w:shd w:fill="E8F2E9" w:color="auto" w:val="clear"/>
             <w:tcMar>
               <w:top w:type="dxa" w:w="140"/>
               <w:left w:type="dxa" w:w="200"/>
@@ -250,7 +248,7 @@
                 <w:rFonts w:ascii="Calibri" w:cs="Calibri" w:eastAsia="Calibri" w:hAnsi="Calibri"/>
                 <w:b/>
                 <w:bCs/>
-                <w:color w:val="5C5C5A"/>
+                <w:color w:val="52656A"/>
                 <w:spacing w:val="20"/>
                 <w:sz w:val="15"/>
                 <w:szCs w:val="15"/>
@@ -264,7 +262,7 @@
                 <w:rFonts w:ascii="Calibri" w:cs="Calibri" w:eastAsia="Calibri" w:hAnsi="Calibri"/>
                 <w:b/>
                 <w:bCs/>
-                <w:color w:val="1D1D1B"/>
+                <w:color w:val="183A43"/>
                 <w:sz w:val="20"/>
                 <w:szCs w:val="20"/>
               </w:rPr>
@@ -275,7 +273,7 @@
         <w:tc>
           <w:tcPr>
             <w:tcW w:type="dxa" w:w="2520"/>
-            <w:shd w:fill="E8EEF7" w:color="auto" w:val="clear"/>
+            <w:shd w:fill="E8F2E9" w:color="auto" w:val="clear"/>
             <w:tcMar>
               <w:top w:type="dxa" w:w="140"/>
               <w:left w:type="dxa" w:w="200"/>
@@ -292,7 +290,7 @@
                 <w:rFonts w:ascii="Calibri" w:cs="Calibri" w:eastAsia="Calibri" w:hAnsi="Calibri"/>
                 <w:b/>
                 <w:bCs/>
-                <w:color w:val="5C5C5A"/>
+                <w:color w:val="52656A"/>
                 <w:spacing w:val="20"/>
                 <w:sz w:val="15"/>
                 <w:szCs w:val="15"/>
@@ -306,7 +304,7 @@
                 <w:rFonts w:ascii="Calibri" w:cs="Calibri" w:eastAsia="Calibri" w:hAnsi="Calibri"/>
                 <w:b/>
                 <w:bCs/>
-                <w:color w:val="1D1D1B"/>
+                <w:color w:val="183A43"/>
                 <w:sz w:val="20"/>
                 <w:szCs w:val="20"/>
               </w:rPr>
@@ -326,20 +324,29 @@
         <w:pStyle w:val="Heading1"/>
         <w:keepNext/>
         <w:pBdr>
-          <w:bottom w:val="single" w:color="0A4A92" w:sz="18" w:space="4"/>
+          <w:bottom w:val="single" w:color="CAD6D0" w:sz="4" w:space="4"/>
         </w:pBdr>
         <w:spacing w:after="160" w:before="360"/>
       </w:pPr>
       <w:r>
         <w:rPr>
           <w:rFonts w:ascii="Calibri" w:cs="Calibri" w:eastAsia="Calibri" w:hAnsi="Calibri"/>
+          <w:color w:val="1399B0"/>
+          <w:sz w:val="24"/>
+          <w:szCs w:val="24"/>
+        </w:rPr>
+        <w:t xml:space="preserve">■  </w:t>
+      </w:r>
+      <w:r>
+        <w:rPr>
+          <w:rFonts w:ascii="Calibri" w:cs="Calibri" w:eastAsia="Calibri" w:hAnsi="Calibri"/>
           <w:b/>
           <w:bCs/>
-          <w:color w:val="1D1D1B"/>
-          <w:sz w:val="28"/>
-          <w:szCs w:val="28"/>
-        </w:rPr>
-        <w:t xml:space="preserve">¿QUÉ LOGRARÁS?</w:t>
+          <w:color w:val="183A43"/>
+          <w:sz w:val="30"/>
+          <w:szCs w:val="30"/>
+        </w:rPr>
+        <w:t xml:space="preserve">¿Qué lograrás?</w:t>
       </w:r>
     </w:p>
     <w:tbl>
@@ -364,11 +371,11 @@
             <w:tcW w:type="dxa" w:w="10080"/>
             <w:tcBorders>
               <w:top w:val="none" w:color="FFFFFF" w:sz="0"/>
-              <w:left w:val="single" w:color="0A4A92" w:sz="24"/>
+              <w:left w:val="single" w:color="1399B0" w:sz="24"/>
               <w:bottom w:val="none" w:color="FFFFFF" w:sz="0"/>
               <w:right w:val="none" w:color="FFFFFF" w:sz="0"/>
             </w:tcBorders>
-            <w:shd w:fill="E8EEF7" w:color="auto" w:val="clear"/>
+            <w:shd w:fill="EEEBF8" w:color="auto" w:val="clear"/>
             <w:tcMar>
               <w:top w:type="dxa" w:w="160"/>
               <w:left w:type="dxa" w:w="240"/>
@@ -385,7 +392,7 @@
                 <w:rFonts w:ascii="Calibri" w:cs="Calibri" w:eastAsia="Calibri" w:hAnsi="Calibri"/>
                 <w:b/>
                 <w:bCs/>
-                <w:color w:val="0A4A92"/>
+                <w:color w:val="52656A"/>
                 <w:spacing w:val="20"/>
                 <w:sz w:val="17"/>
                 <w:szCs w:val="17"/>
@@ -400,7 +407,7 @@
             <w:r>
               <w:rPr>
                 <w:rFonts w:ascii="Calibri" w:cs="Calibri" w:eastAsia="Calibri" w:hAnsi="Calibri"/>
-                <w:color w:val="1D1D1B"/>
+                <w:color w:val="183A43"/>
                 <w:sz w:val="23"/>
                 <w:szCs w:val="23"/>
               </w:rPr>
@@ -420,20 +427,29 @@
         <w:pStyle w:val="Heading1"/>
         <w:keepNext/>
         <w:pBdr>
-          <w:bottom w:val="single" w:color="0A4A92" w:sz="18" w:space="4"/>
+          <w:bottom w:val="single" w:color="CAD6D0" w:sz="4" w:space="4"/>
         </w:pBdr>
         <w:spacing w:after="160" w:before="360"/>
       </w:pPr>
       <w:r>
         <w:rPr>
           <w:rFonts w:ascii="Calibri" w:cs="Calibri" w:eastAsia="Calibri" w:hAnsi="Calibri"/>
+          <w:color w:val="1399B0"/>
+          <w:sz w:val="24"/>
+          <w:szCs w:val="24"/>
+        </w:rPr>
+        <w:t xml:space="preserve">■  </w:t>
+      </w:r>
+      <w:r>
+        <w:rPr>
+          <w:rFonts w:ascii="Calibri" w:cs="Calibri" w:eastAsia="Calibri" w:hAnsi="Calibri"/>
           <w:b/>
           <w:bCs/>
-          <w:color w:val="1D1D1B"/>
-          <w:sz w:val="28"/>
-          <w:szCs w:val="28"/>
-        </w:rPr>
-        <w:t xml:space="preserve">PARA EMPEZAR</w:t>
+          <w:color w:val="183A43"/>
+          <w:sz w:val="30"/>
+          <w:szCs w:val="30"/>
+        </w:rPr>
+        <w:t xml:space="preserve">Para empezar</w:t>
       </w:r>
     </w:p>
     <w:p>
@@ -443,7 +459,7 @@
       <w:r>
         <w:rPr>
           <w:rFonts w:ascii="Calibri" w:cs="Calibri" w:eastAsia="Calibri" w:hAnsi="Calibri"/>
-          <w:color w:val="1D1D1B"/>
+          <w:color w:val="183A43"/>
           <w:sz w:val="22"/>
           <w:szCs w:val="22"/>
         </w:rPr>
@@ -457,7 +473,7 @@
       <w:r>
         <w:rPr>
           <w:rFonts w:ascii="Calibri" w:cs="Calibri" w:eastAsia="Calibri" w:hAnsi="Calibri"/>
-          <w:color w:val="1D1D1B"/>
+          <w:color w:val="183A43"/>
           <w:sz w:val="22"/>
           <w:szCs w:val="22"/>
         </w:rPr>
@@ -475,7 +491,7 @@
           <w:rFonts w:ascii="Calibri" w:cs="Calibri" w:eastAsia="Calibri" w:hAnsi="Calibri"/>
           <w:b/>
           <w:bCs/>
-          <w:color w:val="1D1D1B"/>
+          <w:color w:val="183A43"/>
           <w:sz w:val="23"/>
           <w:szCs w:val="23"/>
         </w:rPr>
@@ -494,7 +510,7 @@
       <w:r>
         <w:rPr>
           <w:rFonts w:ascii="Calibri" w:cs="Calibri" w:eastAsia="Calibri" w:hAnsi="Calibri"/>
-          <w:color w:val="1D1D1B"/>
+          <w:color w:val="183A43"/>
           <w:sz w:val="22"/>
           <w:szCs w:val="22"/>
         </w:rPr>
@@ -513,7 +529,7 @@
       <w:r>
         <w:rPr>
           <w:rFonts w:ascii="Calibri" w:cs="Calibri" w:eastAsia="Calibri" w:hAnsi="Calibri"/>
-          <w:color w:val="1D1D1B"/>
+          <w:color w:val="183A43"/>
           <w:sz w:val="22"/>
           <w:szCs w:val="22"/>
         </w:rPr>
@@ -532,7 +548,7 @@
       <w:r>
         <w:rPr>
           <w:rFonts w:ascii="Calibri" w:cs="Calibri" w:eastAsia="Calibri" w:hAnsi="Calibri"/>
-          <w:color w:val="1D1D1B"/>
+          <w:color w:val="183A43"/>
           <w:sz w:val="22"/>
           <w:szCs w:val="22"/>
         </w:rPr>
@@ -544,20 +560,29 @@
         <w:pStyle w:val="Heading1"/>
         <w:keepNext/>
         <w:pBdr>
-          <w:bottom w:val="single" w:color="0A4A92" w:sz="18" w:space="4"/>
+          <w:bottom w:val="single" w:color="CAD6D0" w:sz="4" w:space="4"/>
         </w:pBdr>
         <w:spacing w:after="160" w:before="360"/>
       </w:pPr>
       <w:r>
         <w:rPr>
           <w:rFonts w:ascii="Calibri" w:cs="Calibri" w:eastAsia="Calibri" w:hAnsi="Calibri"/>
+          <w:color w:val="1399B0"/>
+          <w:sz w:val="24"/>
+          <w:szCs w:val="24"/>
+        </w:rPr>
+        <w:t xml:space="preserve">■  </w:t>
+      </w:r>
+      <w:r>
+        <w:rPr>
+          <w:rFonts w:ascii="Calibri" w:cs="Calibri" w:eastAsia="Calibri" w:hAnsi="Calibri"/>
           <w:b/>
           <w:bCs/>
-          <w:color w:val="1D1D1B"/>
-          <w:sz w:val="28"/>
-          <w:szCs w:val="28"/>
-        </w:rPr>
-        <w:t xml:space="preserve">PASO A PASO</w:t>
+          <w:color w:val="183A43"/>
+          <w:sz w:val="30"/>
+          <w:szCs w:val="30"/>
+        </w:rPr>
+        <w:t xml:space="preserve">Paso a paso</w:t>
       </w:r>
     </w:p>
     <w:p>
@@ -565,9 +590,9 @@
         <w:pStyle w:val="Heading2"/>
         <w:keepNext/>
         <w:pBdr>
-          <w:left w:val="single" w:color="0A4A92" w:sz="36" w:space="8"/>
+          <w:left w:val="single" w:color="1399B0" w:sz="36" w:space="8"/>
         </w:pBdr>
-        <w:shd w:fill="E8EEF7" w:color="auto" w:val="clear"/>
+        <w:shd w:fill="F1F4F0" w:color="auto" w:val="clear"/>
         <w:spacing w:after="100" w:before="280"/>
         <w:ind w:left="160"/>
       </w:pPr>
@@ -576,7 +601,7 @@
           <w:rFonts w:ascii="Calibri" w:cs="Calibri" w:eastAsia="Calibri" w:hAnsi="Calibri"/>
           <w:b/>
           <w:bCs/>
-          <w:color w:val="0A4A92"/>
+          <w:color w:val="52656A"/>
           <w:spacing w:val="20"/>
           <w:sz w:val="18"/>
           <w:szCs w:val="18"/>
@@ -594,7 +619,7 @@
           <w:rFonts w:ascii="Calibri" w:cs="Calibri" w:eastAsia="Calibri" w:hAnsi="Calibri"/>
           <w:b/>
           <w:bCs/>
-          <w:color w:val="1D1D1B"/>
+          <w:color w:val="183A43"/>
           <w:sz w:val="24"/>
           <w:szCs w:val="24"/>
         </w:rPr>
@@ -613,7 +638,7 @@
       <w:r>
         <w:rPr>
           <w:rFonts w:ascii="Calibri" w:cs="Calibri" w:eastAsia="Calibri" w:hAnsi="Calibri"/>
-          <w:color w:val="1D1D1B"/>
+          <w:color w:val="183A43"/>
           <w:sz w:val="22"/>
           <w:szCs w:val="22"/>
         </w:rPr>
@@ -632,7 +657,7 @@
       <w:r>
         <w:rPr>
           <w:rFonts w:ascii="Calibri" w:cs="Calibri" w:eastAsia="Calibri" w:hAnsi="Calibri"/>
-          <w:color w:val="1D1D1B"/>
+          <w:color w:val="183A43"/>
           <w:sz w:val="22"/>
           <w:szCs w:val="22"/>
         </w:rPr>
@@ -644,9 +669,9 @@
         <w:pStyle w:val="Heading2"/>
         <w:keepNext/>
         <w:pBdr>
-          <w:left w:val="single" w:color="0A4A92" w:sz="36" w:space="8"/>
+          <w:left w:val="single" w:color="1399B0" w:sz="36" w:space="8"/>
         </w:pBdr>
-        <w:shd w:fill="E8EEF7" w:color="auto" w:val="clear"/>
+        <w:shd w:fill="F1F4F0" w:color="auto" w:val="clear"/>
         <w:spacing w:after="100" w:before="280"/>
         <w:ind w:left="160"/>
       </w:pPr>
@@ -655,7 +680,7 @@
           <w:rFonts w:ascii="Calibri" w:cs="Calibri" w:eastAsia="Calibri" w:hAnsi="Calibri"/>
           <w:b/>
           <w:bCs/>
-          <w:color w:val="0A4A92"/>
+          <w:color w:val="52656A"/>
           <w:spacing w:val="20"/>
           <w:sz w:val="18"/>
           <w:szCs w:val="18"/>
@@ -673,7 +698,7 @@
           <w:rFonts w:ascii="Calibri" w:cs="Calibri" w:eastAsia="Calibri" w:hAnsi="Calibri"/>
           <w:b/>
           <w:bCs/>
-          <w:color w:val="1D1D1B"/>
+          <w:color w:val="183A43"/>
           <w:sz w:val="24"/>
           <w:szCs w:val="24"/>
         </w:rPr>
@@ -692,7 +717,7 @@
       <w:r>
         <w:rPr>
           <w:rFonts w:ascii="Calibri" w:cs="Calibri" w:eastAsia="Calibri" w:hAnsi="Calibri"/>
-          <w:color w:val="1D1D1B"/>
+          <w:color w:val="183A43"/>
           <w:sz w:val="22"/>
           <w:szCs w:val="22"/>
         </w:rPr>
@@ -711,7 +736,7 @@
       <w:r>
         <w:rPr>
           <w:rFonts w:ascii="Calibri" w:cs="Calibri" w:eastAsia="Calibri" w:hAnsi="Calibri"/>
-          <w:color w:val="1D1D1B"/>
+          <w:color w:val="183A43"/>
           <w:sz w:val="22"/>
           <w:szCs w:val="22"/>
         </w:rPr>
@@ -740,11 +765,11 @@
             <w:tcW w:type="dxa" w:w="10080"/>
             <w:tcBorders>
               <w:top w:val="none" w:color="FFFFFF" w:sz="0"/>
-              <w:left w:val="single" w:color="EF7D00" w:sz="24"/>
+              <w:left w:val="single" w:color="F37012" w:sz="24"/>
               <w:bottom w:val="none" w:color="FFFFFF" w:sz="0"/>
               <w:right w:val="none" w:color="FFFFFF" w:sz="0"/>
             </w:tcBorders>
-            <w:shd w:fill="FFF4DC" w:color="auto" w:val="clear"/>
+            <w:shd w:fill="E8F2E9" w:color="auto" w:val="clear"/>
             <w:tcMar>
               <w:top w:type="dxa" w:w="160"/>
               <w:left w:type="dxa" w:w="240"/>
@@ -761,7 +786,7 @@
                 <w:rFonts w:ascii="Calibri" w:cs="Calibri" w:eastAsia="Calibri" w:hAnsi="Calibri"/>
                 <w:b/>
                 <w:bCs/>
-                <w:color w:val="8A5A00"/>
+                <w:color w:val="52656A"/>
                 <w:spacing w:val="20"/>
                 <w:sz w:val="17"/>
                 <w:szCs w:val="17"/>
@@ -776,7 +801,7 @@
             <w:r>
               <w:rPr>
                 <w:rFonts w:ascii="Calibri" w:cs="Calibri" w:eastAsia="Calibri" w:hAnsi="Calibri"/>
-                <w:color w:val="1D1D1B"/>
+                <w:color w:val="183A43"/>
                 <w:sz w:val="22"/>
                 <w:szCs w:val="22"/>
               </w:rPr>
@@ -796,9 +821,9 @@
         <w:pStyle w:val="Heading2"/>
         <w:keepNext/>
         <w:pBdr>
-          <w:left w:val="single" w:color="0A4A92" w:sz="36" w:space="8"/>
+          <w:left w:val="single" w:color="1399B0" w:sz="36" w:space="8"/>
         </w:pBdr>
-        <w:shd w:fill="E8EEF7" w:color="auto" w:val="clear"/>
+        <w:shd w:fill="F1F4F0" w:color="auto" w:val="clear"/>
         <w:spacing w:after="100" w:before="280"/>
         <w:ind w:left="160"/>
       </w:pPr>
@@ -807,7 +832,7 @@
           <w:rFonts w:ascii="Calibri" w:cs="Calibri" w:eastAsia="Calibri" w:hAnsi="Calibri"/>
           <w:b/>
           <w:bCs/>
-          <w:color w:val="0A4A92"/>
+          <w:color w:val="52656A"/>
           <w:spacing w:val="20"/>
           <w:sz w:val="18"/>
           <w:szCs w:val="18"/>
@@ -825,7 +850,7 @@
           <w:rFonts w:ascii="Calibri" w:cs="Calibri" w:eastAsia="Calibri" w:hAnsi="Calibri"/>
           <w:b/>
           <w:bCs/>
-          <w:color w:val="1D1D1B"/>
+          <w:color w:val="183A43"/>
           <w:sz w:val="24"/>
           <w:szCs w:val="24"/>
         </w:rPr>
@@ -844,7 +869,7 @@
       <w:r>
         <w:rPr>
           <w:rFonts w:ascii="Calibri" w:cs="Calibri" w:eastAsia="Calibri" w:hAnsi="Calibri"/>
-          <w:color w:val="1D1D1B"/>
+          <w:color w:val="183A43"/>
           <w:sz w:val="22"/>
           <w:szCs w:val="22"/>
         </w:rPr>
@@ -863,7 +888,7 @@
       <w:r>
         <w:rPr>
           <w:rFonts w:ascii="Calibri" w:cs="Calibri" w:eastAsia="Calibri" w:hAnsi="Calibri"/>
-          <w:color w:val="1D1D1B"/>
+          <w:color w:val="183A43"/>
           <w:sz w:val="22"/>
           <w:szCs w:val="22"/>
         </w:rPr>
@@ -882,7 +907,7 @@
       <w:r>
         <w:rPr>
           <w:rFonts w:ascii="Calibri" w:cs="Calibri" w:eastAsia="Calibri" w:hAnsi="Calibri"/>
-          <w:color w:val="1D1D1B"/>
+          <w:color w:val="183A43"/>
           <w:sz w:val="22"/>
           <w:szCs w:val="22"/>
         </w:rPr>
@@ -894,9 +919,9 @@
         <w:pStyle w:val="Heading2"/>
         <w:keepNext/>
         <w:pBdr>
-          <w:left w:val="single" w:color="0A4A92" w:sz="36" w:space="8"/>
+          <w:left w:val="single" w:color="1399B0" w:sz="36" w:space="8"/>
         </w:pBdr>
-        <w:shd w:fill="E8EEF7" w:color="auto" w:val="clear"/>
+        <w:shd w:fill="F1F4F0" w:color="auto" w:val="clear"/>
         <w:spacing w:after="100" w:before="280"/>
         <w:ind w:left="160"/>
       </w:pPr>
@@ -905,7 +930,7 @@
           <w:rFonts w:ascii="Calibri" w:cs="Calibri" w:eastAsia="Calibri" w:hAnsi="Calibri"/>
           <w:b/>
           <w:bCs/>
-          <w:color w:val="0A4A92"/>
+          <w:color w:val="52656A"/>
           <w:spacing w:val="20"/>
           <w:sz w:val="18"/>
           <w:szCs w:val="18"/>
@@ -923,7 +948,7 @@
           <w:rFonts w:ascii="Calibri" w:cs="Calibri" w:eastAsia="Calibri" w:hAnsi="Calibri"/>
           <w:b/>
           <w:bCs/>
-          <w:color w:val="1D1D1B"/>
+          <w:color w:val="183A43"/>
           <w:sz w:val="24"/>
           <w:szCs w:val="24"/>
         </w:rPr>
@@ -942,7 +967,7 @@
       <w:r>
         <w:rPr>
           <w:rFonts w:ascii="Calibri" w:cs="Calibri" w:eastAsia="Calibri" w:hAnsi="Calibri"/>
-          <w:color w:val="1D1D1B"/>
+          <w:color w:val="183A43"/>
           <w:sz w:val="22"/>
           <w:szCs w:val="22"/>
         </w:rPr>
@@ -961,7 +986,7 @@
       <w:r>
         <w:rPr>
           <w:rFonts w:ascii="Calibri" w:cs="Calibri" w:eastAsia="Calibri" w:hAnsi="Calibri"/>
-          <w:color w:val="1D1D1B"/>
+          <w:color w:val="183A43"/>
           <w:sz w:val="22"/>
           <w:szCs w:val="22"/>
         </w:rPr>
@@ -980,7 +1005,7 @@
       <w:r>
         <w:rPr>
           <w:rFonts w:ascii="Calibri" w:cs="Calibri" w:eastAsia="Calibri" w:hAnsi="Calibri"/>
-          <w:color w:val="1D1D1B"/>
+          <w:color w:val="183A43"/>
           <w:sz w:val="22"/>
           <w:szCs w:val="22"/>
         </w:rPr>
@@ -999,7 +1024,7 @@
       <w:r>
         <w:rPr>
           <w:rFonts w:ascii="Calibri" w:cs="Calibri" w:eastAsia="Calibri" w:hAnsi="Calibri"/>
-          <w:color w:val="1D1D1B"/>
+          <w:color w:val="183A43"/>
           <w:sz w:val="22"/>
           <w:szCs w:val="22"/>
         </w:rPr>
@@ -1011,9 +1036,9 @@
         <w:pStyle w:val="Heading2"/>
         <w:keepNext/>
         <w:pBdr>
-          <w:left w:val="single" w:color="0A4A92" w:sz="36" w:space="8"/>
+          <w:left w:val="single" w:color="1399B0" w:sz="36" w:space="8"/>
         </w:pBdr>
-        <w:shd w:fill="E8EEF7" w:color="auto" w:val="clear"/>
+        <w:shd w:fill="F1F4F0" w:color="auto" w:val="clear"/>
         <w:spacing w:after="100" w:before="280"/>
         <w:ind w:left="160"/>
       </w:pPr>
@@ -1022,7 +1047,7 @@
           <w:rFonts w:ascii="Calibri" w:cs="Calibri" w:eastAsia="Calibri" w:hAnsi="Calibri"/>
           <w:b/>
           <w:bCs/>
-          <w:color w:val="0A4A92"/>
+          <w:color w:val="52656A"/>
           <w:spacing w:val="20"/>
           <w:sz w:val="18"/>
           <w:szCs w:val="18"/>
@@ -1040,7 +1065,7 @@
           <w:rFonts w:ascii="Calibri" w:cs="Calibri" w:eastAsia="Calibri" w:hAnsi="Calibri"/>
           <w:b/>
           <w:bCs/>
-          <w:color w:val="1D1D1B"/>
+          <w:color w:val="183A43"/>
           <w:sz w:val="24"/>
           <w:szCs w:val="24"/>
         </w:rPr>
@@ -1059,7 +1084,7 @@
       <w:r>
         <w:rPr>
           <w:rFonts w:ascii="Calibri" w:cs="Calibri" w:eastAsia="Calibri" w:hAnsi="Calibri"/>
-          <w:color w:val="1D1D1B"/>
+          <w:color w:val="183A43"/>
           <w:sz w:val="22"/>
           <w:szCs w:val="22"/>
         </w:rPr>
@@ -1078,7 +1103,7 @@
       <w:r>
         <w:rPr>
           <w:rFonts w:ascii="Calibri" w:cs="Calibri" w:eastAsia="Calibri" w:hAnsi="Calibri"/>
-          <w:color w:val="1D1D1B"/>
+          <w:color w:val="183A43"/>
           <w:sz w:val="22"/>
           <w:szCs w:val="22"/>
         </w:rPr>
@@ -1090,9 +1115,9 @@
         <w:pStyle w:val="Heading2"/>
         <w:keepNext/>
         <w:pBdr>
-          <w:left w:val="single" w:color="0A4A92" w:sz="36" w:space="8"/>
+          <w:left w:val="single" w:color="1399B0" w:sz="36" w:space="8"/>
         </w:pBdr>
-        <w:shd w:fill="E8EEF7" w:color="auto" w:val="clear"/>
+        <w:shd w:fill="F1F4F0" w:color="auto" w:val="clear"/>
         <w:spacing w:after="100" w:before="280"/>
         <w:ind w:left="160"/>
       </w:pPr>
@@ -1101,7 +1126,7 @@
           <w:rFonts w:ascii="Calibri" w:cs="Calibri" w:eastAsia="Calibri" w:hAnsi="Calibri"/>
           <w:b/>
           <w:bCs/>
-          <w:color w:val="0A4A92"/>
+          <w:color w:val="52656A"/>
           <w:spacing w:val="20"/>
           <w:sz w:val="18"/>
           <w:szCs w:val="18"/>
@@ -1119,7 +1144,7 @@
           <w:rFonts w:ascii="Calibri" w:cs="Calibri" w:eastAsia="Calibri" w:hAnsi="Calibri"/>
           <w:b/>
           <w:bCs/>
-          <w:color w:val="1D1D1B"/>
+          <w:color w:val="183A43"/>
           <w:sz w:val="24"/>
           <w:szCs w:val="24"/>
         </w:rPr>
@@ -1138,7 +1163,7 @@
       <w:r>
         <w:rPr>
           <w:rFonts w:ascii="Calibri" w:cs="Calibri" w:eastAsia="Calibri" w:hAnsi="Calibri"/>
-          <w:color w:val="1D1D1B"/>
+          <w:color w:val="183A43"/>
           <w:sz w:val="22"/>
           <w:szCs w:val="22"/>
         </w:rPr>
@@ -1157,7 +1182,7 @@
       <w:r>
         <w:rPr>
           <w:rFonts w:ascii="Calibri" w:cs="Calibri" w:eastAsia="Calibri" w:hAnsi="Calibri"/>
-          <w:color w:val="1D1D1B"/>
+          <w:color w:val="183A43"/>
           <w:sz w:val="22"/>
           <w:szCs w:val="22"/>
         </w:rPr>
@@ -1176,7 +1201,7 @@
       <w:r>
         <w:rPr>
           <w:rFonts w:ascii="Calibri" w:cs="Calibri" w:eastAsia="Calibri" w:hAnsi="Calibri"/>
-          <w:color w:val="1D1D1B"/>
+          <w:color w:val="183A43"/>
           <w:sz w:val="22"/>
           <w:szCs w:val="22"/>
         </w:rPr>
@@ -1188,9 +1213,9 @@
         <w:pStyle w:val="Heading2"/>
         <w:keepNext/>
         <w:pBdr>
-          <w:left w:val="single" w:color="0A4A92" w:sz="36" w:space="8"/>
+          <w:left w:val="single" w:color="1399B0" w:sz="36" w:space="8"/>
         </w:pBdr>
-        <w:shd w:fill="E8EEF7" w:color="auto" w:val="clear"/>
+        <w:shd w:fill="F1F4F0" w:color="auto" w:val="clear"/>
         <w:spacing w:after="100" w:before="280"/>
         <w:ind w:left="160"/>
       </w:pPr>
@@ -1199,7 +1224,7 @@
           <w:rFonts w:ascii="Calibri" w:cs="Calibri" w:eastAsia="Calibri" w:hAnsi="Calibri"/>
           <w:b/>
           <w:bCs/>
-          <w:color w:val="0A4A92"/>
+          <w:color w:val="52656A"/>
           <w:spacing w:val="20"/>
           <w:sz w:val="18"/>
           <w:szCs w:val="18"/>
@@ -1217,7 +1242,7 @@
           <w:rFonts w:ascii="Calibri" w:cs="Calibri" w:eastAsia="Calibri" w:hAnsi="Calibri"/>
           <w:b/>
           <w:bCs/>
-          <w:color w:val="1D1D1B"/>
+          <w:color w:val="183A43"/>
           <w:sz w:val="24"/>
           <w:szCs w:val="24"/>
         </w:rPr>
@@ -1236,7 +1261,7 @@
       <w:r>
         <w:rPr>
           <w:rFonts w:ascii="Calibri" w:cs="Calibri" w:eastAsia="Calibri" w:hAnsi="Calibri"/>
-          <w:color w:val="1D1D1B"/>
+          <w:color w:val="183A43"/>
           <w:sz w:val="22"/>
           <w:szCs w:val="22"/>
         </w:rPr>
@@ -1255,7 +1280,7 @@
       <w:r>
         <w:rPr>
           <w:rFonts w:ascii="Calibri" w:cs="Calibri" w:eastAsia="Calibri" w:hAnsi="Calibri"/>
-          <w:color w:val="1D1D1B"/>
+          <w:color w:val="183A43"/>
           <w:sz w:val="22"/>
           <w:szCs w:val="22"/>
         </w:rPr>
@@ -1284,11 +1309,11 @@
             <w:tcW w:type="dxa" w:w="10080"/>
             <w:tcBorders>
               <w:top w:val="none" w:color="FFFFFF" w:sz="0"/>
-              <w:left w:val="single" w:color="EF7D00" w:sz="24"/>
+              <w:left w:val="single" w:color="F37012" w:sz="24"/>
               <w:bottom w:val="none" w:color="FFFFFF" w:sz="0"/>
               <w:right w:val="none" w:color="FFFFFF" w:sz="0"/>
             </w:tcBorders>
-            <w:shd w:fill="FFF4DC" w:color="auto" w:val="clear"/>
+            <w:shd w:fill="E8F2E9" w:color="auto" w:val="clear"/>
             <w:tcMar>
               <w:top w:type="dxa" w:w="160"/>
               <w:left w:type="dxa" w:w="240"/>
@@ -1305,7 +1330,7 @@
                 <w:rFonts w:ascii="Calibri" w:cs="Calibri" w:eastAsia="Calibri" w:hAnsi="Calibri"/>
                 <w:b/>
                 <w:bCs/>
-                <w:color w:val="8A5A00"/>
+                <w:color w:val="52656A"/>
                 <w:spacing w:val="20"/>
                 <w:sz w:val="17"/>
                 <w:szCs w:val="17"/>
@@ -1320,7 +1345,7 @@
             <w:r>
               <w:rPr>
                 <w:rFonts w:ascii="Calibri" w:cs="Calibri" w:eastAsia="Calibri" w:hAnsi="Calibri"/>
-                <w:color w:val="1D1D1B"/>
+                <w:color w:val="183A43"/>
                 <w:sz w:val="22"/>
                 <w:szCs w:val="22"/>
               </w:rPr>
@@ -1340,32 +1365,41 @@
         <w:pStyle w:val="Heading1"/>
         <w:keepNext/>
         <w:pBdr>
-          <w:bottom w:val="single" w:color="0A4A92" w:sz="18" w:space="4"/>
+          <w:bottom w:val="single" w:color="CAD6D0" w:sz="4" w:space="4"/>
         </w:pBdr>
         <w:spacing w:after="160" w:before="360"/>
       </w:pPr>
       <w:r>
         <w:rPr>
           <w:rFonts w:ascii="Calibri" w:cs="Calibri" w:eastAsia="Calibri" w:hAnsi="Calibri"/>
+          <w:color w:val="1399B0"/>
+          <w:sz w:val="24"/>
+          <w:szCs w:val="24"/>
+        </w:rPr>
+        <w:t xml:space="preserve">■  </w:t>
+      </w:r>
+      <w:r>
+        <w:rPr>
+          <w:rFonts w:ascii="Calibri" w:cs="Calibri" w:eastAsia="Calibri" w:hAnsi="Calibri"/>
           <w:b/>
           <w:bCs/>
-          <w:color w:val="1D1D1B"/>
-          <w:sz w:val="28"/>
-          <w:szCs w:val="28"/>
-        </w:rPr>
-        <w:t xml:space="preserve">MAPA RÁPIDO DE LA INTERFAZ</w:t>
+          <w:color w:val="183A43"/>
+          <w:sz w:val="30"/>
+          <w:szCs w:val="30"/>
+        </w:rPr>
+        <w:t xml:space="preserve">Mapa rápido de la interfaz</w:t>
       </w:r>
     </w:p>
     <w:tbl>
       <w:tblPr>
         <w:tblW w:type="dxa" w:w="10080"/>
         <w:tblBorders>
-          <w:top w:val="single" w:color="E2E2DF" w:sz="4"/>
-          <w:left w:val="single" w:color="E2E2DF" w:sz="4"/>
-          <w:bottom w:val="single" w:color="E2E2DF" w:sz="4"/>
-          <w:right w:val="single" w:color="E2E2DF" w:sz="4"/>
-          <w:insideH w:val="single" w:color="E2E2DF" w:sz="4"/>
-          <w:insideV w:val="single" w:color="E2E2DF" w:sz="4"/>
+          <w:top w:val="single" w:color="CAD6D0" w:sz="4"/>
+          <w:left w:val="single" w:color="CAD6D0" w:sz="4"/>
+          <w:bottom w:val="single" w:color="CAD6D0" w:sz="4"/>
+          <w:right w:val="single" w:color="CAD6D0" w:sz="4"/>
+          <w:insideH w:val="single" w:color="CAD6D0" w:sz="4"/>
+          <w:insideV w:val="single" w:color="CAD6D0" w:sz="4"/>
         </w:tblBorders>
         <w:tblLayout w:type="fixed"/>
       </w:tblPr>
@@ -1381,7 +1415,7 @@
         <w:tc>
           <w:tcPr>
             <w:tcW w:type="dxa" w:w="3427"/>
-            <w:shd w:fill="0A4A92" w:color="auto" w:val="clear"/>
+            <w:shd w:fill="E8F2E9" w:color="auto" w:val="clear"/>
             <w:tcMar>
               <w:top w:type="dxa" w:w="100"/>
               <w:left w:type="dxa" w:w="140"/>
@@ -1398,7 +1432,7 @@
               <w:rPr>
                 <w:b/>
                 <w:bCs/>
-                <w:color w:val="FFFFFF"/>
+                <w:color w:val="183A43"/>
                 <w:sz w:val="20"/>
                 <w:szCs w:val="20"/>
               </w:rPr>
@@ -1409,7 +1443,7 @@
         <w:tc>
           <w:tcPr>
             <w:tcW w:type="dxa" w:w="3629"/>
-            <w:shd w:fill="0A4A92" w:color="auto" w:val="clear"/>
+            <w:shd w:fill="E8F2E9" w:color="auto" w:val="clear"/>
             <w:tcMar>
               <w:top w:type="dxa" w:w="100"/>
               <w:left w:type="dxa" w:w="140"/>
@@ -1426,7 +1460,7 @@
               <w:rPr>
                 <w:b/>
                 <w:bCs/>
-                <w:color w:val="FFFFFF"/>
+                <w:color w:val="183A43"/>
                 <w:sz w:val="20"/>
                 <w:szCs w:val="20"/>
               </w:rPr>
@@ -1437,7 +1471,7 @@
         <w:tc>
           <w:tcPr>
             <w:tcW w:type="dxa" w:w="3024"/>
-            <w:shd w:fill="0A4A92" w:color="auto" w:val="clear"/>
+            <w:shd w:fill="E8F2E9" w:color="auto" w:val="clear"/>
             <w:tcMar>
               <w:top w:type="dxa" w:w="100"/>
               <w:left w:type="dxa" w:w="140"/>
@@ -1454,7 +1488,7 @@
               <w:rPr>
                 <w:b/>
                 <w:bCs/>
-                <w:color w:val="FFFFFF"/>
+                <w:color w:val="183A43"/>
                 <w:sz w:val="20"/>
                 <w:szCs w:val="20"/>
               </w:rPr>
@@ -1487,7 +1521,7 @@
               <w:rPr>
                 <w:b/>
                 <w:bCs/>
-                <w:color w:val="1D1D1B"/>
+                <w:color w:val="183A43"/>
                 <w:sz w:val="20"/>
                 <w:szCs w:val="20"/>
               </w:rPr>
@@ -1515,7 +1549,7 @@
               <w:rPr>
                 <w:b w:val="false"/>
                 <w:bCs w:val="false"/>
-                <w:color w:val="1D1D1B"/>
+                <w:color w:val="183A43"/>
                 <w:sz w:val="20"/>
                 <w:szCs w:val="20"/>
               </w:rPr>
@@ -1543,7 +1577,7 @@
               <w:rPr>
                 <w:b w:val="false"/>
                 <w:bCs w:val="false"/>
-                <w:color w:val="1D1D1B"/>
+                <w:color w:val="183A43"/>
                 <w:sz w:val="20"/>
                 <w:szCs w:val="20"/>
               </w:rPr>
@@ -1559,7 +1593,7 @@
         <w:tc>
           <w:tcPr>
             <w:tcW w:type="dxa" w:w="3427"/>
-            <w:shd w:fill="F4F4F2" w:color="auto" w:val="clear"/>
+            <w:shd w:fill="F1F4F0" w:color="auto" w:val="clear"/>
             <w:tcMar>
               <w:top w:type="dxa" w:w="100"/>
               <w:left w:type="dxa" w:w="140"/>
@@ -1576,7 +1610,7 @@
               <w:rPr>
                 <w:b/>
                 <w:bCs/>
-                <w:color w:val="1D1D1B"/>
+                <w:color w:val="183A43"/>
                 <w:sz w:val="20"/>
                 <w:szCs w:val="20"/>
               </w:rPr>
@@ -1587,7 +1621,7 @@
         <w:tc>
           <w:tcPr>
             <w:tcW w:type="dxa" w:w="3629"/>
-            <w:shd w:fill="F4F4F2" w:color="auto" w:val="clear"/>
+            <w:shd w:fill="F1F4F0" w:color="auto" w:val="clear"/>
             <w:tcMar>
               <w:top w:type="dxa" w:w="100"/>
               <w:left w:type="dxa" w:w="140"/>
@@ -1604,7 +1638,7 @@
               <w:rPr>
                 <w:b w:val="false"/>
                 <w:bCs w:val="false"/>
-                <w:color w:val="1D1D1B"/>
+                <w:color w:val="183A43"/>
                 <w:sz w:val="20"/>
                 <w:szCs w:val="20"/>
               </w:rPr>
@@ -1615,7 +1649,7 @@
         <w:tc>
           <w:tcPr>
             <w:tcW w:type="dxa" w:w="3024"/>
-            <w:shd w:fill="F4F4F2" w:color="auto" w:val="clear"/>
+            <w:shd w:fill="F1F4F0" w:color="auto" w:val="clear"/>
             <w:tcMar>
               <w:top w:type="dxa" w:w="100"/>
               <w:left w:type="dxa" w:w="140"/>
@@ -1632,7 +1666,7 @@
               <w:rPr>
                 <w:b w:val="false"/>
                 <w:bCs w:val="false"/>
-                <w:color w:val="1D1D1B"/>
+                <w:color w:val="183A43"/>
                 <w:sz w:val="20"/>
                 <w:szCs w:val="20"/>
               </w:rPr>
@@ -1665,7 +1699,7 @@
               <w:rPr>
                 <w:b/>
                 <w:bCs/>
-                <w:color w:val="1D1D1B"/>
+                <w:color w:val="183A43"/>
                 <w:sz w:val="20"/>
                 <w:szCs w:val="20"/>
               </w:rPr>
@@ -1693,7 +1727,7 @@
               <w:rPr>
                 <w:b w:val="false"/>
                 <w:bCs w:val="false"/>
-                <w:color w:val="1D1D1B"/>
+                <w:color w:val="183A43"/>
                 <w:sz w:val="20"/>
                 <w:szCs w:val="20"/>
               </w:rPr>
@@ -1721,7 +1755,7 @@
               <w:rPr>
                 <w:b w:val="false"/>
                 <w:bCs w:val="false"/>
-                <w:color w:val="1D1D1B"/>
+                <w:color w:val="183A43"/>
                 <w:sz w:val="20"/>
                 <w:szCs w:val="20"/>
               </w:rPr>
@@ -1737,7 +1771,7 @@
         <w:tc>
           <w:tcPr>
             <w:tcW w:type="dxa" w:w="3427"/>
-            <w:shd w:fill="F4F4F2" w:color="auto" w:val="clear"/>
+            <w:shd w:fill="F1F4F0" w:color="auto" w:val="clear"/>
             <w:tcMar>
               <w:top w:type="dxa" w:w="100"/>
               <w:left w:type="dxa" w:w="140"/>
@@ -1754,7 +1788,7 @@
               <w:rPr>
                 <w:b/>
                 <w:bCs/>
-                <w:color w:val="1D1D1B"/>
+                <w:color w:val="183A43"/>
                 <w:sz w:val="20"/>
                 <w:szCs w:val="20"/>
               </w:rPr>
@@ -1765,7 +1799,7 @@
         <w:tc>
           <w:tcPr>
             <w:tcW w:type="dxa" w:w="3629"/>
-            <w:shd w:fill="F4F4F2" w:color="auto" w:val="clear"/>
+            <w:shd w:fill="F1F4F0" w:color="auto" w:val="clear"/>
             <w:tcMar>
               <w:top w:type="dxa" w:w="100"/>
               <w:left w:type="dxa" w:w="140"/>
@@ -1782,7 +1816,7 @@
               <w:rPr>
                 <w:b w:val="false"/>
                 <w:bCs w:val="false"/>
-                <w:color w:val="1D1D1B"/>
+                <w:color w:val="183A43"/>
                 <w:sz w:val="20"/>
                 <w:szCs w:val="20"/>
               </w:rPr>
@@ -1793,7 +1827,7 @@
         <w:tc>
           <w:tcPr>
             <w:tcW w:type="dxa" w:w="3024"/>
-            <w:shd w:fill="F4F4F2" w:color="auto" w:val="clear"/>
+            <w:shd w:fill="F1F4F0" w:color="auto" w:val="clear"/>
             <w:tcMar>
               <w:top w:type="dxa" w:w="100"/>
               <w:left w:type="dxa" w:w="140"/>
@@ -1810,7 +1844,7 @@
               <w:rPr>
                 <w:b w:val="false"/>
                 <w:bCs w:val="false"/>
-                <w:color w:val="1D1D1B"/>
+                <w:color w:val="183A43"/>
                 <w:sz w:val="20"/>
                 <w:szCs w:val="20"/>
               </w:rPr>
@@ -1843,7 +1877,7 @@
               <w:rPr>
                 <w:b/>
                 <w:bCs/>
-                <w:color w:val="1D1D1B"/>
+                <w:color w:val="183A43"/>
                 <w:sz w:val="20"/>
                 <w:szCs w:val="20"/>
               </w:rPr>
@@ -1871,7 +1905,7 @@
               <w:rPr>
                 <w:b w:val="false"/>
                 <w:bCs w:val="false"/>
-                <w:color w:val="1D1D1B"/>
+                <w:color w:val="183A43"/>
                 <w:sz w:val="20"/>
                 <w:szCs w:val="20"/>
               </w:rPr>
@@ -1899,7 +1933,7 @@
               <w:rPr>
                 <w:b w:val="false"/>
                 <w:bCs w:val="false"/>
-                <w:color w:val="1D1D1B"/>
+                <w:color w:val="183A43"/>
                 <w:sz w:val="20"/>
                 <w:szCs w:val="20"/>
               </w:rPr>
@@ -1915,7 +1949,7 @@
         <w:tc>
           <w:tcPr>
             <w:tcW w:type="dxa" w:w="3427"/>
-            <w:shd w:fill="F4F4F2" w:color="auto" w:val="clear"/>
+            <w:shd w:fill="F1F4F0" w:color="auto" w:val="clear"/>
             <w:tcMar>
               <w:top w:type="dxa" w:w="100"/>
               <w:left w:type="dxa" w:w="140"/>
@@ -1932,7 +1966,7 @@
               <w:rPr>
                 <w:b/>
                 <w:bCs/>
-                <w:color w:val="1D1D1B"/>
+                <w:color w:val="183A43"/>
                 <w:sz w:val="20"/>
                 <w:szCs w:val="20"/>
               </w:rPr>
@@ -1943,7 +1977,7 @@
         <w:tc>
           <w:tcPr>
             <w:tcW w:type="dxa" w:w="3629"/>
-            <w:shd w:fill="F4F4F2" w:color="auto" w:val="clear"/>
+            <w:shd w:fill="F1F4F0" w:color="auto" w:val="clear"/>
             <w:tcMar>
               <w:top w:type="dxa" w:w="100"/>
               <w:left w:type="dxa" w:w="140"/>
@@ -1960,7 +1994,7 @@
               <w:rPr>
                 <w:b w:val="false"/>
                 <w:bCs w:val="false"/>
-                <w:color w:val="1D1D1B"/>
+                <w:color w:val="183A43"/>
                 <w:sz w:val="20"/>
                 <w:szCs w:val="20"/>
               </w:rPr>
@@ -1971,7 +2005,7 @@
         <w:tc>
           <w:tcPr>
             <w:tcW w:type="dxa" w:w="3024"/>
-            <w:shd w:fill="F4F4F2" w:color="auto" w:val="clear"/>
+            <w:shd w:fill="F1F4F0" w:color="auto" w:val="clear"/>
             <w:tcMar>
               <w:top w:type="dxa" w:w="100"/>
               <w:left w:type="dxa" w:w="140"/>
@@ -1988,7 +2022,7 @@
               <w:rPr>
                 <w:b w:val="false"/>
                 <w:bCs w:val="false"/>
-                <w:color w:val="1D1D1B"/>
+                <w:color w:val="183A43"/>
                 <w:sz w:val="20"/>
                 <w:szCs w:val="20"/>
               </w:rPr>
@@ -2008,20 +2042,29 @@
         <w:pStyle w:val="Heading1"/>
         <w:keepNext/>
         <w:pBdr>
-          <w:bottom w:val="single" w:color="0A4A92" w:sz="18" w:space="4"/>
+          <w:bottom w:val="single" w:color="CAD6D0" w:sz="4" w:space="4"/>
         </w:pBdr>
         <w:spacing w:after="160" w:before="360"/>
       </w:pPr>
       <w:r>
         <w:rPr>
           <w:rFonts w:ascii="Calibri" w:cs="Calibri" w:eastAsia="Calibri" w:hAnsi="Calibri"/>
+          <w:color w:val="1399B0"/>
+          <w:sz w:val="24"/>
+          <w:szCs w:val="24"/>
+        </w:rPr>
+        <w:t xml:space="preserve">■  </w:t>
+      </w:r>
+      <w:r>
+        <w:rPr>
+          <w:rFonts w:ascii="Calibri" w:cs="Calibri" w:eastAsia="Calibri" w:hAnsi="Calibri"/>
           <w:b/>
           <w:bCs/>
-          <w:color w:val="1D1D1B"/>
-          <w:sz w:val="28"/>
-          <w:szCs w:val="28"/>
-        </w:rPr>
-        <w:t xml:space="preserve">BUENAS PRÁCTICAS</w:t>
+          <w:color w:val="183A43"/>
+          <w:sz w:val="30"/>
+          <w:szCs w:val="30"/>
+        </w:rPr>
+        <w:t xml:space="preserve">Buenas prácticas</w:t>
       </w:r>
     </w:p>
     <w:p>
@@ -2036,7 +2079,7 @@
       <w:r>
         <w:rPr>
           <w:rFonts w:ascii="Calibri" w:cs="Calibri" w:eastAsia="Calibri" w:hAnsi="Calibri"/>
-          <w:color w:val="1D1D1B"/>
+          <w:color w:val="183A43"/>
           <w:sz w:val="22"/>
           <w:szCs w:val="22"/>
         </w:rPr>
@@ -2055,7 +2098,7 @@
       <w:r>
         <w:rPr>
           <w:rFonts w:ascii="Calibri" w:cs="Calibri" w:eastAsia="Calibri" w:hAnsi="Calibri"/>
-          <w:color w:val="1D1D1B"/>
+          <w:color w:val="183A43"/>
           <w:sz w:val="22"/>
           <w:szCs w:val="22"/>
         </w:rPr>
@@ -2074,7 +2117,7 @@
       <w:r>
         <w:rPr>
           <w:rFonts w:ascii="Calibri" w:cs="Calibri" w:eastAsia="Calibri" w:hAnsi="Calibri"/>
-          <w:color w:val="1D1D1B"/>
+          <w:color w:val="183A43"/>
           <w:sz w:val="22"/>
           <w:szCs w:val="22"/>
         </w:rPr>
@@ -2086,32 +2129,41 @@
         <w:pStyle w:val="Heading1"/>
         <w:keepNext/>
         <w:pBdr>
-          <w:bottom w:val="single" w:color="0A4A92" w:sz="18" w:space="4"/>
+          <w:bottom w:val="single" w:color="CAD6D0" w:sz="4" w:space="4"/>
         </w:pBdr>
         <w:spacing w:after="160" w:before="360"/>
       </w:pPr>
       <w:r>
         <w:rPr>
           <w:rFonts w:ascii="Calibri" w:cs="Calibri" w:eastAsia="Calibri" w:hAnsi="Calibri"/>
+          <w:color w:val="1399B0"/>
+          <w:sz w:val="24"/>
+          <w:szCs w:val="24"/>
+        </w:rPr>
+        <w:t xml:space="preserve">■  </w:t>
+      </w:r>
+      <w:r>
+        <w:rPr>
+          <w:rFonts w:ascii="Calibri" w:cs="Calibri" w:eastAsia="Calibri" w:hAnsi="Calibri"/>
           <w:b/>
           <w:bCs/>
-          <w:color w:val="1D1D1B"/>
-          <w:sz w:val="28"/>
-          <w:szCs w:val="28"/>
-        </w:rPr>
-        <w:t xml:space="preserve">ERRORES FRECUENTES Y CÓMO RESOLVERLOS</w:t>
+          <w:color w:val="183A43"/>
+          <w:sz w:val="30"/>
+          <w:szCs w:val="30"/>
+        </w:rPr>
+        <w:t xml:space="preserve">Errores frecuentes y cómo resolverlos</w:t>
       </w:r>
     </w:p>
     <w:tbl>
       <w:tblPr>
         <w:tblW w:type="dxa" w:w="10080"/>
         <w:tblBorders>
-          <w:top w:val="single" w:color="E2E2DF" w:sz="4"/>
-          <w:left w:val="single" w:color="E2E2DF" w:sz="4"/>
-          <w:bottom w:val="single" w:color="E2E2DF" w:sz="4"/>
-          <w:right w:val="single" w:color="E2E2DF" w:sz="4"/>
-          <w:insideH w:val="single" w:color="E2E2DF" w:sz="4"/>
-          <w:insideV w:val="single" w:color="E2E2DF" w:sz="4"/>
+          <w:top w:val="single" w:color="CAD6D0" w:sz="4"/>
+          <w:left w:val="single" w:color="CAD6D0" w:sz="4"/>
+          <w:bottom w:val="single" w:color="CAD6D0" w:sz="4"/>
+          <w:right w:val="single" w:color="CAD6D0" w:sz="4"/>
+          <w:insideH w:val="single" w:color="CAD6D0" w:sz="4"/>
+          <w:insideV w:val="single" w:color="CAD6D0" w:sz="4"/>
         </w:tblBorders>
         <w:tblLayout w:type="fixed"/>
       </w:tblPr>
@@ -2126,7 +2178,7 @@
         <w:tc>
           <w:tcPr>
             <w:tcW w:type="dxa" w:w="3629"/>
-            <w:shd w:fill="0A4A92" w:color="auto" w:val="clear"/>
+            <w:shd w:fill="E8F2E9" w:color="auto" w:val="clear"/>
             <w:tcMar>
               <w:top w:type="dxa" w:w="100"/>
               <w:left w:type="dxa" w:w="140"/>
@@ -2143,7 +2195,7 @@
               <w:rPr>
                 <w:b/>
                 <w:bCs/>
-                <w:color w:val="FFFFFF"/>
+                <w:color w:val="183A43"/>
                 <w:sz w:val="20"/>
                 <w:szCs w:val="20"/>
               </w:rPr>
@@ -2154,7 +2206,7 @@
         <w:tc>
           <w:tcPr>
             <w:tcW w:type="dxa" w:w="6451"/>
-            <w:shd w:fill="0A4A92" w:color="auto" w:val="clear"/>
+            <w:shd w:fill="E8F2E9" w:color="auto" w:val="clear"/>
             <w:tcMar>
               <w:top w:type="dxa" w:w="100"/>
               <w:left w:type="dxa" w:w="140"/>
@@ -2171,7 +2223,7 @@
               <w:rPr>
                 <w:b/>
                 <w:bCs/>
-                <w:color w:val="FFFFFF"/>
+                <w:color w:val="183A43"/>
                 <w:sz w:val="20"/>
                 <w:szCs w:val="20"/>
               </w:rPr>
@@ -2204,7 +2256,7 @@
               <w:rPr>
                 <w:b/>
                 <w:bCs/>
-                <w:color w:val="1D1D1B"/>
+                <w:color w:val="183A43"/>
                 <w:sz w:val="20"/>
                 <w:szCs w:val="20"/>
               </w:rPr>
@@ -2232,7 +2284,7 @@
               <w:rPr>
                 <w:b w:val="false"/>
                 <w:bCs w:val="false"/>
-                <w:color w:val="1D1D1B"/>
+                <w:color w:val="183A43"/>
                 <w:sz w:val="20"/>
                 <w:szCs w:val="20"/>
               </w:rPr>
@@ -2248,7 +2300,7 @@
         <w:tc>
           <w:tcPr>
             <w:tcW w:type="dxa" w:w="3629"/>
-            <w:shd w:fill="F4F4F2" w:color="auto" w:val="clear"/>
+            <w:shd w:fill="F1F4F0" w:color="auto" w:val="clear"/>
             <w:tcMar>
               <w:top w:type="dxa" w:w="100"/>
               <w:left w:type="dxa" w:w="140"/>
@@ -2265,7 +2317,7 @@
               <w:rPr>
                 <w:b/>
                 <w:bCs/>
-                <w:color w:val="1D1D1B"/>
+                <w:color w:val="183A43"/>
                 <w:sz w:val="20"/>
                 <w:szCs w:val="20"/>
               </w:rPr>
@@ -2276,7 +2328,7 @@
         <w:tc>
           <w:tcPr>
             <w:tcW w:type="dxa" w:w="6451"/>
-            <w:shd w:fill="F4F4F2" w:color="auto" w:val="clear"/>
+            <w:shd w:fill="F1F4F0" w:color="auto" w:val="clear"/>
             <w:tcMar>
               <w:top w:type="dxa" w:w="100"/>
               <w:left w:type="dxa" w:w="140"/>
@@ -2293,7 +2345,7 @@
               <w:rPr>
                 <w:b w:val="false"/>
                 <w:bCs w:val="false"/>
-                <w:color w:val="1D1D1B"/>
+                <w:color w:val="183A43"/>
                 <w:sz w:val="20"/>
                 <w:szCs w:val="20"/>
               </w:rPr>
@@ -2326,7 +2378,7 @@
               <w:rPr>
                 <w:b/>
                 <w:bCs/>
-                <w:color w:val="1D1D1B"/>
+                <w:color w:val="183A43"/>
                 <w:sz w:val="20"/>
                 <w:szCs w:val="20"/>
               </w:rPr>
@@ -2354,7 +2406,7 @@
               <w:rPr>
                 <w:b w:val="false"/>
                 <w:bCs w:val="false"/>
-                <w:color w:val="1D1D1B"/>
+                <w:color w:val="183A43"/>
                 <w:sz w:val="20"/>
                 <w:szCs w:val="20"/>
               </w:rPr>
@@ -2374,20 +2426,29 @@
         <w:pStyle w:val="Heading1"/>
         <w:keepNext/>
         <w:pBdr>
-          <w:bottom w:val="single" w:color="0A4A92" w:sz="18" w:space="4"/>
+          <w:bottom w:val="single" w:color="CAD6D0" w:sz="4" w:space="4"/>
         </w:pBdr>
         <w:spacing w:after="160" w:before="360"/>
       </w:pPr>
       <w:r>
         <w:rPr>
           <w:rFonts w:ascii="Calibri" w:cs="Calibri" w:eastAsia="Calibri" w:hAnsi="Calibri"/>
+          <w:color w:val="1399B0"/>
+          <w:sz w:val="24"/>
+          <w:szCs w:val="24"/>
+        </w:rPr>
+        <w:t xml:space="preserve">■  </w:t>
+      </w:r>
+      <w:r>
+        <w:rPr>
+          <w:rFonts w:ascii="Calibri" w:cs="Calibri" w:eastAsia="Calibri" w:hAnsi="Calibri"/>
           <w:b/>
           <w:bCs/>
-          <w:color w:val="1D1D1B"/>
-          <w:sz w:val="28"/>
-          <w:szCs w:val="28"/>
-        </w:rPr>
-        <w:t xml:space="preserve">RETO PRÁCTICO</w:t>
+          <w:color w:val="183A43"/>
+          <w:sz w:val="30"/>
+          <w:szCs w:val="30"/>
+        </w:rPr>
+        <w:t xml:space="preserve">Reto práctico</w:t>
       </w:r>
     </w:p>
     <w:tbl>
@@ -2412,11 +2473,11 @@
             <w:tcW w:type="dxa" w:w="10080"/>
             <w:tcBorders>
               <w:top w:val="none" w:color="FFFFFF" w:sz="0"/>
-              <w:left w:val="single" w:color="1D1D1B" w:sz="24"/>
+              <w:left w:val="single" w:color="183A43" w:sz="24"/>
               <w:bottom w:val="none" w:color="FFFFFF" w:sz="0"/>
               <w:right w:val="none" w:color="FFFFFF" w:sz="0"/>
             </w:tcBorders>
-            <w:shd w:fill="F4F4F2" w:color="auto" w:val="clear"/>
+            <w:shd w:fill="FFFFFF" w:color="auto" w:val="clear"/>
             <w:tcMar>
               <w:top w:type="dxa" w:w="160"/>
               <w:left w:type="dxa" w:w="240"/>
@@ -2433,7 +2494,7 @@
                 <w:rFonts w:ascii="Calibri" w:cs="Calibri" w:eastAsia="Calibri" w:hAnsi="Calibri"/>
                 <w:b/>
                 <w:bCs/>
-                <w:color w:val="1D1D1B"/>
+                <w:color w:val="52656A"/>
                 <w:spacing w:val="20"/>
                 <w:sz w:val="17"/>
                 <w:szCs w:val="17"/>
@@ -2448,7 +2509,7 @@
             <w:r>
               <w:rPr>
                 <w:rFonts w:ascii="Calibri" w:cs="Calibri" w:eastAsia="Calibri" w:hAnsi="Calibri"/>
-                <w:color w:val="1D1D1B"/>
+                <w:color w:val="183A43"/>
                 <w:sz w:val="22"/>
                 <w:szCs w:val="22"/>
               </w:rPr>
@@ -2468,20 +2529,29 @@
         <w:pStyle w:val="Heading1"/>
         <w:keepNext/>
         <w:pBdr>
-          <w:bottom w:val="single" w:color="0A4A92" w:sz="18" w:space="4"/>
+          <w:bottom w:val="single" w:color="CAD6D0" w:sz="4" w:space="4"/>
         </w:pBdr>
         <w:spacing w:after="160" w:before="360"/>
       </w:pPr>
       <w:r>
         <w:rPr>
           <w:rFonts w:ascii="Calibri" w:cs="Calibri" w:eastAsia="Calibri" w:hAnsi="Calibri"/>
+          <w:color w:val="1399B0"/>
+          <w:sz w:val="24"/>
+          <w:szCs w:val="24"/>
+        </w:rPr>
+        <w:t xml:space="preserve">■  </w:t>
+      </w:r>
+      <w:r>
+        <w:rPr>
+          <w:rFonts w:ascii="Calibri" w:cs="Calibri" w:eastAsia="Calibri" w:hAnsi="Calibri"/>
           <w:b/>
           <w:bCs/>
-          <w:color w:val="1D1D1B"/>
-          <w:sz w:val="28"/>
-          <w:szCs w:val="28"/>
-        </w:rPr>
-        <w:t xml:space="preserve">VERIFICA TU AVANCE</w:t>
+          <w:color w:val="183A43"/>
+          <w:sz w:val="30"/>
+          <w:szCs w:val="30"/>
+        </w:rPr>
+        <w:t xml:space="preserve">Verifica tu avance</w:t>
       </w:r>
     </w:p>
     <w:p>
@@ -2495,7 +2565,7 @@
       <w:r>
         <w:rPr>
           <w:rFonts w:ascii="Segoe UI Symbol" w:cs="Segoe UI Symbol" w:eastAsia="Segoe UI Symbol" w:hAnsi="Segoe UI Symbol"/>
-          <w:color w:val="5C5C5A"/>
+          <w:color w:val="52656A"/>
           <w:sz w:val="26"/>
           <w:szCs w:val="26"/>
         </w:rPr>
@@ -2504,7 +2574,7 @@
       <w:r>
         <w:rPr>
           <w:rFonts w:ascii="Calibri" w:cs="Calibri" w:eastAsia="Calibri" w:hAnsi="Calibri"/>
-          <w:color w:val="1D1D1B"/>
+          <w:color w:val="183A43"/>
           <w:sz w:val="22"/>
           <w:szCs w:val="22"/>
         </w:rPr>
@@ -2522,7 +2592,7 @@
       <w:r>
         <w:rPr>
           <w:rFonts w:ascii="Segoe UI Symbol" w:cs="Segoe UI Symbol" w:eastAsia="Segoe UI Symbol" w:hAnsi="Segoe UI Symbol"/>
-          <w:color w:val="5C5C5A"/>
+          <w:color w:val="52656A"/>
           <w:sz w:val="26"/>
           <w:szCs w:val="26"/>
         </w:rPr>
@@ -2531,7 +2601,7 @@
       <w:r>
         <w:rPr>
           <w:rFonts w:ascii="Calibri" w:cs="Calibri" w:eastAsia="Calibri" w:hAnsi="Calibri"/>
-          <w:color w:val="1D1D1B"/>
+          <w:color w:val="183A43"/>
           <w:sz w:val="22"/>
           <w:szCs w:val="22"/>
         </w:rPr>
@@ -2549,7 +2619,7 @@
       <w:r>
         <w:rPr>
           <w:rFonts w:ascii="Segoe UI Symbol" w:cs="Segoe UI Symbol" w:eastAsia="Segoe UI Symbol" w:hAnsi="Segoe UI Symbol"/>
-          <w:color w:val="5C5C5A"/>
+          <w:color w:val="52656A"/>
           <w:sz w:val="26"/>
           <w:szCs w:val="26"/>
         </w:rPr>
@@ -2558,7 +2628,7 @@
       <w:r>
         <w:rPr>
           <w:rFonts w:ascii="Calibri" w:cs="Calibri" w:eastAsia="Calibri" w:hAnsi="Calibri"/>
-          <w:color w:val="1D1D1B"/>
+          <w:color w:val="183A43"/>
           <w:sz w:val="22"/>
           <w:szCs w:val="22"/>
         </w:rPr>
@@ -2576,7 +2646,7 @@
       <w:r>
         <w:rPr>
           <w:rFonts w:ascii="Segoe UI Symbol" w:cs="Segoe UI Symbol" w:eastAsia="Segoe UI Symbol" w:hAnsi="Segoe UI Symbol"/>
-          <w:color w:val="5C5C5A"/>
+          <w:color w:val="52656A"/>
           <w:sz w:val="26"/>
           <w:szCs w:val="26"/>
         </w:rPr>
@@ -2585,7 +2655,7 @@
       <w:r>
         <w:rPr>
           <w:rFonts w:ascii="Calibri" w:cs="Calibri" w:eastAsia="Calibri" w:hAnsi="Calibri"/>
-          <w:color w:val="1D1D1B"/>
+          <w:color w:val="183A43"/>
           <w:sz w:val="22"/>
           <w:szCs w:val="22"/>
         </w:rPr>
@@ -2619,11 +2689,11 @@
             <w:tcW w:type="dxa" w:w="10080"/>
             <w:tcBorders>
               <w:top w:val="none" w:color="FFFFFF" w:sz="0"/>
-              <w:left w:val="single" w:color="EF7D00" w:sz="24"/>
+              <w:left w:val="single" w:color="F37012" w:sz="24"/>
               <w:bottom w:val="none" w:color="FFFFFF" w:sz="0"/>
               <w:right w:val="none" w:color="FFFFFF" w:sz="0"/>
             </w:tcBorders>
-            <w:shd w:fill="1D1D1B" w:color="auto" w:val="clear"/>
+            <w:shd w:fill="0D2227" w:color="auto" w:val="clear"/>
             <w:tcMar>
               <w:top w:type="dxa" w:w="240"/>
               <w:left w:type="dxa" w:w="300"/>
@@ -2640,7 +2710,7 @@
                 <w:rFonts w:ascii="Calibri" w:cs="Calibri" w:eastAsia="Calibri" w:hAnsi="Calibri"/>
                 <w:b/>
                 <w:bCs/>
-                <w:color w:val="EF7D00"/>
+                <w:color w:val="FFAD79"/>
                 <w:sz w:val="24"/>
                 <w:szCs w:val="24"/>
               </w:rPr>
@@ -2665,7 +2735,7 @@
             <w:r>
               <w:rPr>
                 <w:rFonts w:ascii="Calibri" w:cs="Calibri" w:eastAsia="Calibri" w:hAnsi="Calibri"/>
-                <w:color w:val="D1D5DB"/>
+                <w:color w:val="B4C4C6"/>
                 <w:sz w:val="18"/>
                 <w:szCs w:val="18"/>
               </w:rPr>
@@ -2735,7 +2805,7 @@
     <w:r>
       <w:rPr>
         <w:rFonts w:ascii="Calibri" w:cs="Calibri" w:eastAsia="Calibri" w:hAnsi="Calibri"/>
-        <w:color w:val="5C5C5A"/>
+        <w:color w:val="52656A"/>
         <w:sz w:val="16"/>
         <w:szCs w:val="16"/>
       </w:rPr>
@@ -2744,7 +2814,7 @@
     <w:r>
       <w:rPr>
         <w:rFonts w:ascii="Calibri" w:cs="Calibri" w:eastAsia="Calibri" w:hAnsi="Calibri"/>
-        <w:color w:val="5C5C5A"/>
+        <w:color w:val="52656A"/>
         <w:sz w:val="16"/>
         <w:szCs w:val="16"/>
       </w:rPr>
@@ -2753,7 +2823,7 @@
     <w:r>
       <w:rPr>
         <w:rFonts w:ascii="Calibri" w:cs="Calibri" w:eastAsia="Calibri" w:hAnsi="Calibri"/>
-        <w:color w:val="5C5C5A"/>
+        <w:color w:val="52656A"/>
         <w:sz w:val="16"/>
         <w:szCs w:val="16"/>
       </w:rPr>
@@ -2765,7 +2835,7 @@
     <w:r>
       <w:rPr>
         <w:rFonts w:ascii="Calibri" w:cs="Calibri" w:eastAsia="Calibri" w:hAnsi="Calibri"/>
-        <w:color w:val="5C5C5A"/>
+        <w:color w:val="52656A"/>
         <w:sz w:val="16"/>
         <w:szCs w:val="16"/>
       </w:rPr>
@@ -2774,7 +2844,7 @@
     <w:r>
       <w:rPr>
         <w:rFonts w:ascii="Calibri" w:cs="Calibri" w:eastAsia="Calibri" w:hAnsi="Calibri"/>
-        <w:color w:val="5C5C5A"/>
+        <w:color w:val="52656A"/>
         <w:sz w:val="16"/>
         <w:szCs w:val="16"/>
       </w:rPr>
@@ -2829,7 +2899,7 @@
   <w:p>
     <w:pPr>
       <w:pBdr>
-        <w:bottom w:val="single" w:color="E2E2DF" w:sz="4" w:space="6"/>
+        <w:bottom w:val="single" w:color="CAD6D0" w:sz="4" w:space="6"/>
       </w:pBdr>
       <w:tabs>
         <w:tab w:val="right" w:pos="10080"/>
@@ -2840,7 +2910,7 @@
         <w:rFonts w:ascii="Calibri" w:cs="Calibri" w:eastAsia="Calibri" w:hAnsi="Calibri"/>
         <w:b/>
         <w:bCs/>
-        <w:color w:val="A65200"/>
+        <w:color w:val="087F91"/>
         <w:sz w:val="17"/>
         <w:szCs w:val="17"/>
       </w:rPr>
@@ -2849,7 +2919,7 @@
     <w:r>
       <w:rPr>
         <w:rFonts w:ascii="Calibri" w:cs="Calibri" w:eastAsia="Calibri" w:hAnsi="Calibri"/>
-        <w:color w:val="5C5C5A"/>
+        <w:color w:val="52656A"/>
         <w:sz w:val="17"/>
         <w:szCs w:val="17"/>
       </w:rPr>
@@ -2860,7 +2930,7 @@
         <w:rFonts w:ascii="Calibri" w:cs="Calibri" w:eastAsia="Calibri" w:hAnsi="Calibri"/>
         <w:b/>
         <w:bCs/>
-        <w:color w:val="0A4A92"/>
+        <w:color w:val="183A43"/>
         <w:sz w:val="17"/>
         <w:szCs w:val="17"/>
       </w:rPr>
@@ -2969,7 +3039,7 @@
       <w:rPr>
         <w:b/>
         <w:bCs/>
-        <w:color w:val="EF7D00"/>
+        <w:color w:val="F37012"/>
       </w:rPr>
     </w:lvl>
   </w:abstractNum>
@@ -2994,7 +3064,7 @@
     <w:rPrDefault>
       <w:rPr>
         <w:rFonts w:ascii="Calibri" w:cs="Calibri" w:eastAsia="Calibri" w:hAnsi="Calibri"/>
-        <w:color w:val="1D1D1B"/>
+        <w:color w:val="183A43"/>
         <w:sz w:val="22"/>
         <w:szCs w:val="22"/>
       </w:rPr>
@@ -3174,7 +3244,7 @@
       <w:rFonts w:ascii="Calibri" w:cs="Calibri" w:eastAsia="Calibri" w:hAnsi="Calibri"/>
       <w:b/>
       <w:bCs/>
-      <w:color w:val="1D1D1B"/>
+      <w:color w:val="183A43"/>
       <w:sz w:val="28"/>
       <w:szCs w:val="28"/>
     </w:rPr>
@@ -3191,7 +3261,7 @@
       <w:rFonts w:ascii="Calibri" w:cs="Calibri" w:eastAsia="Calibri" w:hAnsi="Calibri"/>
       <w:b/>
       <w:bCs/>
-      <w:color w:val="1D1D1B"/>
+      <w:color w:val="183A43"/>
       <w:sz w:val="24"/>
       <w:szCs w:val="24"/>
     </w:rPr>
@@ -3208,7 +3278,7 @@
       <w:rFonts w:ascii="Calibri" w:cs="Calibri" w:eastAsia="Calibri" w:hAnsi="Calibri"/>
       <w:b/>
       <w:bCs/>
-      <w:color w:val="1D1D1B"/>
+      <w:color w:val="183A43"/>
       <w:sz w:val="23"/>
       <w:szCs w:val="23"/>
     </w:rPr>

</xml_diff>

<commit_message>
Optimiza los PDF, quita la sección de acompañamiento y adapta la página al celular
- PDF: logo en JPG y bandas nocturnas en color plano (20 MB -> 6,1 MB).
- Se retira «¿Necesitas acompañamiento?» de la página, los PDF y los Word.
- Menú desplegable hasta 999 px (Escape y toque fuera lo cierran); sin
  JavaScript los enlaces quedan visibles. Ajustes de botones, filtros,
  tarjetas y lector en pantallas pequeñas.

Co-Authored-By: Claude Opus 5.5 <noreply@anthropic.com>
</commit_message>
<xml_diff>
--- a/word/Capsula_01_Conoce_tu_aula_virtual.docx
+++ b/word/Capsula_01_Conoce_tu_aula_virtual.docx
@@ -2664,87 +2664,21 @@
     </w:p>
     <w:p>
       <w:pPr>
-        <w:spacing w:after="240" w:before="0"/>
-      </w:pPr>
-    </w:p>
-    <w:tbl>
-      <w:tblPr>
-        <w:tblW w:type="dxa" w:w="10080"/>
-        <w:tblBorders>
-          <w:top w:val="none" w:color="FFFFFF" w:sz="0"/>
-          <w:left w:val="none" w:color="FFFFFF" w:sz="0"/>
-          <w:bottom w:val="none" w:color="FFFFFF" w:sz="0"/>
-          <w:right w:val="none" w:color="FFFFFF" w:sz="0"/>
-          <w:insideH w:val="none" w:color="FFFFFF" w:sz="0"/>
-          <w:insideV w:val="none" w:color="FFFFFF" w:sz="0"/>
-        </w:tblBorders>
-        <w:tblLayout w:type="fixed"/>
-      </w:tblPr>
-      <w:tblGrid>
-        <w:gridCol w:w="10080"/>
-      </w:tblGrid>
-      <w:tr>
-        <w:tc>
-          <w:tcPr>
-            <w:tcW w:type="dxa" w:w="10080"/>
-            <w:tcBorders>
-              <w:top w:val="none" w:color="FFFFFF" w:sz="0"/>
-              <w:left w:val="single" w:color="F37012" w:sz="24"/>
-              <w:bottom w:val="none" w:color="FFFFFF" w:sz="0"/>
-              <w:right w:val="none" w:color="FFFFFF" w:sz="0"/>
-            </w:tcBorders>
-            <w:shd w:fill="0D2227" w:color="auto" w:val="clear"/>
-            <w:tcMar>
-              <w:top w:type="dxa" w:w="240"/>
-              <w:left w:type="dxa" w:w="300"/>
-              <w:bottom w:type="dxa" w:w="240"/>
-              <w:right w:type="dxa" w:w="300"/>
-            </w:tcMar>
-          </w:tcPr>
-          <w:p>
-            <w:pPr>
-              <w:spacing w:after="60"/>
-            </w:pPr>
-            <w:r>
-              <w:rPr>
-                <w:rFonts w:ascii="Calibri" w:cs="Calibri" w:eastAsia="Calibri" w:hAnsi="Calibri"/>
-                <w:b/>
-                <w:bCs/>
-                <w:color w:val="FFAD79"/>
-                <w:sz w:val="24"/>
-                <w:szCs w:val="24"/>
-              </w:rPr>
-              <w:t xml:space="preserve">¿Necesitas acompañamiento?</w:t>
-            </w:r>
-          </w:p>
-          <w:p>
-            <w:pPr>
-              <w:spacing w:after="60"/>
-            </w:pPr>
-            <w:r>
-              <w:rPr>
-                <w:rFonts w:ascii="Calibri" w:cs="Calibri" w:eastAsia="Calibri" w:hAnsi="Calibri"/>
-                <w:color w:val="FFFFFF"/>
-                <w:sz w:val="21"/>
-                <w:szCs w:val="21"/>
-              </w:rPr>
-              <w:t xml:space="preserve">El equipo del CEA te ayuda a implementar esta cápsula en tu curso.</w:t>
-            </w:r>
-          </w:p>
-          <w:p>
-            <w:r>
-              <w:rPr>
-                <w:rFonts w:ascii="Calibri" w:cs="Calibri" w:eastAsia="Calibri" w:hAnsi="Calibri"/>
-                <w:color w:val="B4C4C6"/>
-                <w:sz w:val="18"/>
-                <w:szCs w:val="18"/>
-              </w:rPr>
-              <w:t xml:space="preserve">CEA · Centro de Innovación Pedagógica y Educación Digital — Universidad de San Buenaventura Cali</w:t>
-            </w:r>
-          </w:p>
-        </w:tc>
-      </w:tr>
-    </w:tbl>
+        <w:pBdr>
+          <w:top w:val="single" w:color="CAD6D0" w:sz="4" w:space="8"/>
+        </w:pBdr>
+        <w:spacing w:before="360"/>
+      </w:pPr>
+      <w:r>
+        <w:rPr>
+          <w:rFonts w:ascii="Calibri" w:cs="Calibri" w:eastAsia="Calibri" w:hAnsi="Calibri"/>
+          <w:color w:val="52656A"/>
+          <w:sz w:val="18"/>
+          <w:szCs w:val="18"/>
+        </w:rPr>
+        <w:t xml:space="preserve">CEA · Centro de Innovación Pedagógica y Educación Digital — Universidad de San Buenaventura Cali</w:t>
+      </w:r>
+    </w:p>
     <w:sectPr>
       <w:headerReference w:type="default" r:id="rId6"/>
       <w:footerReference w:type="default" r:id="rId7"/>

</xml_diff>

<commit_message>
Reordena la Ruta 3 de básico a avanzado y aclara el tiempo estimado
- 10 Lista de chequeo (Básico), 11 Seguimiento (Intermedio),
  12 Finalización y restricciones (Avanzado); se actualizan las
  referencias en las cápsulas 11 y 13 y los nombres de archivo.
- «Lectura» pasa a «Tiempo estimado · lectura + práctica».

Co-Authored-By: Claude Opus 5.5 <noreply@anthropic.com>
</commit_message>
<xml_diff>
--- a/word/Capsula_01_Conoce_tu_aula_virtual.docx
+++ b/word/Capsula_01_Conoce_tu_aula_virtual.docx
@@ -253,7 +253,7 @@
                 <w:sz w:val="15"/>
                 <w:szCs w:val="15"/>
               </w:rPr>
-              <w:t xml:space="preserve">TIEMPO DE LECTURA</w:t>
+              <w:t xml:space="preserve">TIEMPO ESTIMADO</w:t>
             </w:r>
           </w:p>
           <w:p>
@@ -266,7 +266,7 @@
                 <w:sz w:val="20"/>
                 <w:szCs w:val="20"/>
               </w:rPr>
-              <w:t xml:space="preserve">15 min</w:t>
+              <w:t xml:space="preserve">15 min (lectura + práctica)</w:t>
             </w:r>
           </w:p>
         </w:tc>

</xml_diff>

<commit_message>
Ajusta las guías a Moodle 4.5 en español internacional
Nombres de la interfaz verificados con el paquete oficial de idioma es
de Moodle 4.5: «Añadir contenido › Actividad o recurso», «Acciones
masivas», «Configuración Calificaciones», «Habilitar seguimiento del
grado de finalización», «Condiciones de finalización de actividad»,
estado «Publicada», «El envío se realiza automáticamente», «Envíos
anónimos», «Usar workflow (flujo de trabajo) de calificaciones» y los
formatos «Secciones personalizadas» y «Secciones semanales».
«Moodle 4.x» pasa a «Moodle 4.5».

Co-Authored-By: Claude Opus 5.5 <noreply@anthropic.com>
</commit_message>
<xml_diff>
--- a/word/Capsula_01_Conoce_tu_aula_virtual.docx
+++ b/word/Capsula_01_Conoce_tu_aula_virtual.docx
@@ -308,7 +308,7 @@
                 <w:sz w:val="20"/>
                 <w:szCs w:val="20"/>
               </w:rPr>
-              <w:t xml:space="preserve">Moodle 4.x</w:t>
+              <w:t xml:space="preserve">Moodle 4.5</w:t>
             </w:r>
           </w:p>
         </w:tc>
@@ -477,7 +477,7 @@
           <w:sz w:val="22"/>
           <w:szCs w:val="22"/>
         </w:rPr>
-        <w:t xml:space="preserve">En esta cápsula harás un recorrido guiado por la interfaz de Moodle 4.x: desde el ingreso a la plataforma hasta los menús internos de un curso.</w:t>
+        <w:t xml:space="preserve">En esta cápsula harás un recorrido guiado por la interfaz de Moodle 4.5: desde el ingreso a la plataforma hasta los menús internos de un curso.</w:t>
       </w:r>
     </w:p>
     <w:p>

</xml_diff>

<commit_message>
Cápsula 01: nombra eCampus, su dirección y los menús propios de la USB
Co-Authored-By: Claude Opus 5.5 <noreply@anthropic.com>
</commit_message>
<xml_diff>
--- a/word/Capsula_01_Conoce_tu_aula_virtual.docx
+++ b/word/Capsula_01_Conoce_tu_aula_virtual.docx
@@ -477,7 +477,27 @@
           <w:sz w:val="22"/>
           <w:szCs w:val="22"/>
         </w:rPr>
-        <w:t xml:space="preserve">En esta cápsula harás un recorrido guiado por la interfaz de Moodle 4.5: desde el ingreso a la plataforma hasta los menús internos de un curso.</w:t>
+        <w:t xml:space="preserve">En esta cápsula harás un recorrido guiado por </w:t>
+      </w:r>
+      <w:r>
+        <w:rPr>
+          <w:rFonts w:ascii="Calibri" w:cs="Calibri" w:eastAsia="Calibri" w:hAnsi="Calibri"/>
+          <w:b/>
+          <w:bCs/>
+          <w:color w:val="183A43"/>
+          <w:sz w:val="22"/>
+          <w:szCs w:val="22"/>
+        </w:rPr>
+        <w:t xml:space="preserve">eCampus</w:t>
+      </w:r>
+      <w:r>
+        <w:rPr>
+          <w:rFonts w:ascii="Calibri" w:cs="Calibri" w:eastAsia="Calibri" w:hAnsi="Calibri"/>
+          <w:color w:val="183A43"/>
+          <w:sz w:val="22"/>
+          <w:szCs w:val="22"/>
+        </w:rPr>
+        <w:t xml:space="preserve">, la plataforma Moodle 4.5 de la Universidad: desde el ingreso hasta los menús internos de un curso.</w:t>
       </w:r>
     </w:p>
     <w:p>
@@ -642,7 +662,106 @@
           <w:sz w:val="22"/>
           <w:szCs w:val="22"/>
         </w:rPr>
-        <w:t xml:space="preserve">Abre el enlace del aula virtual institucional e inicia sesión con tus credenciales.</w:t>
+        <w:t xml:space="preserve">Abre </w:t>
+      </w:r>
+      <w:r>
+        <w:rPr>
+          <w:rFonts w:ascii="Calibri" w:cs="Calibri" w:eastAsia="Calibri" w:hAnsi="Calibri"/>
+          <w:b/>
+          <w:bCs/>
+          <w:color w:val="183A43"/>
+          <w:sz w:val="22"/>
+          <w:szCs w:val="22"/>
+        </w:rPr>
+        <w:t xml:space="preserve">ecampus.usbcali.edu.co</w:t>
+      </w:r>
+      <w:r>
+        <w:rPr>
+          <w:rFonts w:ascii="Calibri" w:cs="Calibri" w:eastAsia="Calibri" w:hAnsi="Calibri"/>
+          <w:color w:val="183A43"/>
+          <w:sz w:val="22"/>
+          <w:szCs w:val="22"/>
+        </w:rPr>
+        <w:t xml:space="preserve"> e inicia sesión con tu usuario y contraseña institucionales.</w:t>
+      </w:r>
+    </w:p>
+    <w:p>
+      <w:pPr>
+        <w:pStyle w:val="ListParagraph"/>
+        <w:numPr>
+          <w:ilvl w:val="0"/>
+          <w:numId w:val="2"/>
+        </w:numPr>
+        <w:spacing w:after="80" w:line="290"/>
+      </w:pPr>
+      <w:r>
+        <w:rPr>
+          <w:rFonts w:ascii="Calibri" w:cs="Calibri" w:eastAsia="Calibri" w:hAnsi="Calibri"/>
+          <w:color w:val="183A43"/>
+          <w:sz w:val="22"/>
+          <w:szCs w:val="22"/>
+        </w:rPr>
+        <w:t xml:space="preserve">En la barra superior verás </w:t>
+      </w:r>
+      <w:r>
+        <w:rPr>
+          <w:rFonts w:ascii="Calibri" w:cs="Calibri" w:eastAsia="Calibri" w:hAnsi="Calibri"/>
+          <w:b/>
+          <w:bCs/>
+          <w:color w:val="183A43"/>
+          <w:sz w:val="22"/>
+          <w:szCs w:val="22"/>
+        </w:rPr>
+        <w:t xml:space="preserve">Área personal</w:t>
+      </w:r>
+      <w:r>
+        <w:rPr>
+          <w:rFonts w:ascii="Calibri" w:cs="Calibri" w:eastAsia="Calibri" w:hAnsi="Calibri"/>
+          <w:color w:val="183A43"/>
+          <w:sz w:val="22"/>
+          <w:szCs w:val="22"/>
+        </w:rPr>
+        <w:t xml:space="preserve"> y </w:t>
+      </w:r>
+      <w:r>
+        <w:rPr>
+          <w:rFonts w:ascii="Calibri" w:cs="Calibri" w:eastAsia="Calibri" w:hAnsi="Calibri"/>
+          <w:b/>
+          <w:bCs/>
+          <w:color w:val="183A43"/>
+          <w:sz w:val="22"/>
+          <w:szCs w:val="22"/>
+        </w:rPr>
+        <w:t xml:space="preserve">Mis cursos</w:t>
+      </w:r>
+      <w:r>
+        <w:rPr>
+          <w:rFonts w:ascii="Calibri" w:cs="Calibri" w:eastAsia="Calibri" w:hAnsi="Calibri"/>
+          <w:color w:val="183A43"/>
+          <w:sz w:val="22"/>
+          <w:szCs w:val="22"/>
+        </w:rPr>
+        <w:t xml:space="preserve">, y también menús propios de la USB: </w:t>
+      </w:r>
+      <w:r>
+        <w:rPr>
+          <w:rFonts w:ascii="Calibri" w:cs="Calibri" w:eastAsia="Calibri" w:hAnsi="Calibri"/>
+          <w:b/>
+          <w:bCs/>
+          <w:color w:val="183A43"/>
+          <w:sz w:val="22"/>
+          <w:szCs w:val="22"/>
+        </w:rPr>
+        <w:t xml:space="preserve">Apoyo al docente</w:t>
+      </w:r>
+      <w:r>
+        <w:rPr>
+          <w:rFonts w:ascii="Calibri" w:cs="Calibri" w:eastAsia="Calibri" w:hAnsi="Calibri"/>
+          <w:color w:val="183A43"/>
+          <w:sz w:val="22"/>
+          <w:szCs w:val="22"/>
+        </w:rPr>
+        <w:t xml:space="preserve">, Apoyo al estudiante, Recursos Educativos y Soporte.</w:t>
       </w:r>
     </w:p>
     <w:p>
@@ -1703,7 +1822,7 @@
                 <w:sz w:val="20"/>
                 <w:szCs w:val="20"/>
               </w:rPr>
-              <w:t xml:space="preserve">Navegación secundaria</w:t>
+              <w:t xml:space="preserve">Apoyo al docente, Apoyo al estudiante, Recursos Educativos y Soporte</w:t>
             </w:r>
           </w:p>
         </w:tc>
@@ -1731,7 +1850,7 @@
                 <w:sz w:val="20"/>
                 <w:szCs w:val="20"/>
               </w:rPr>
-              <w:t xml:space="preserve">Bajo el nombre del curso</w:t>
+              <w:t xml:space="preserve">Barra superior</w:t>
             </w:r>
           </w:p>
         </w:tc>
@@ -1759,7 +1878,7 @@
                 <w:sz w:val="20"/>
                 <w:szCs w:val="20"/>
               </w:rPr>
-              <w:t xml:space="preserve">Configurar, ver participantes, calificaciones e informes</w:t>
+              <w:t xml:space="preserve">Acceder a los apoyos, recursos y canales de soporte de la Universidad</w:t>
             </w:r>
           </w:p>
         </w:tc>
@@ -1792,7 +1911,7 @@
                 <w:sz w:val="20"/>
                 <w:szCs w:val="20"/>
               </w:rPr>
-              <w:t xml:space="preserve">Índice del curso</w:t>
+              <w:t xml:space="preserve">Navegación secundaria</w:t>
             </w:r>
           </w:p>
         </w:tc>
@@ -1820,7 +1939,7 @@
                 <w:sz w:val="20"/>
                 <w:szCs w:val="20"/>
               </w:rPr>
-              <w:t xml:space="preserve">Panel izquierdo</w:t>
+              <w:t xml:space="preserve">Bajo el nombre del curso</w:t>
             </w:r>
           </w:p>
         </w:tc>
@@ -1848,7 +1967,7 @@
                 <w:sz w:val="20"/>
                 <w:szCs w:val="20"/>
               </w:rPr>
-              <w:t xml:space="preserve">Moverte entre secciones y actividades</w:t>
+              <w:t xml:space="preserve">Configurar, ver participantes, calificaciones e informes</w:t>
             </w:r>
           </w:p>
         </w:tc>
@@ -1881,7 +2000,7 @@
                 <w:sz w:val="20"/>
                 <w:szCs w:val="20"/>
               </w:rPr>
-              <w:t xml:space="preserve">Cajón de bloques</w:t>
+              <w:t xml:space="preserve">Índice del curso</w:t>
             </w:r>
           </w:p>
         </w:tc>
@@ -1909,7 +2028,7 @@
                 <w:sz w:val="20"/>
                 <w:szCs w:val="20"/>
               </w:rPr>
-              <w:t xml:space="preserve">Panel derecho</w:t>
+              <w:t xml:space="preserve">Panel izquierdo</w:t>
             </w:r>
           </w:p>
         </w:tc>
@@ -1937,7 +2056,7 @@
                 <w:sz w:val="20"/>
                 <w:szCs w:val="20"/>
               </w:rPr>
-              <w:t xml:space="preserve">Consultar bloques de apoyo (avisos, calendario)</w:t>
+              <w:t xml:space="preserve">Moverte entre secciones y actividades</w:t>
             </w:r>
           </w:p>
         </w:tc>
@@ -1970,7 +2089,7 @@
                 <w:sz w:val="20"/>
                 <w:szCs w:val="20"/>
               </w:rPr>
-              <w:t xml:space="preserve">Menú de usuario</w:t>
+              <w:t xml:space="preserve">Cajón de bloques</w:t>
             </w:r>
           </w:p>
         </w:tc>
@@ -1998,7 +2117,7 @@
                 <w:sz w:val="20"/>
                 <w:szCs w:val="20"/>
               </w:rPr>
-              <w:t xml:space="preserve">Foto o iniciales, arriba a la derecha</w:t>
+              <w:t xml:space="preserve">Panel derecho</w:t>
             </w:r>
           </w:p>
         </w:tc>
@@ -2006,6 +2125,95 @@
           <w:tcPr>
             <w:tcW w:type="dxa" w:w="3024"/>
             <w:shd w:fill="F1F4F0" w:color="auto" w:val="clear"/>
+            <w:tcMar>
+              <w:top w:type="dxa" w:w="100"/>
+              <w:left w:type="dxa" w:w="140"/>
+              <w:bottom w:type="dxa" w:w="100"/>
+              <w:right w:type="dxa" w:w="140"/>
+            </w:tcMar>
+            <w:vAlign w:val="center"/>
+          </w:tcPr>
+          <w:p>
+            <w:pPr>
+              <w:jc w:val="left"/>
+            </w:pPr>
+            <w:r>
+              <w:rPr>
+                <w:b w:val="false"/>
+                <w:bCs w:val="false"/>
+                <w:color w:val="183A43"/>
+                <w:sz w:val="20"/>
+                <w:szCs w:val="20"/>
+              </w:rPr>
+              <w:t xml:space="preserve">Consultar bloques de apoyo (avisos, calendario)</w:t>
+            </w:r>
+          </w:p>
+        </w:tc>
+      </w:tr>
+      <w:tr>
+        <w:trPr>
+          <w:cantSplit/>
+        </w:trPr>
+        <w:tc>
+          <w:tcPr>
+            <w:tcW w:type="dxa" w:w="3427"/>
+            <w:shd w:fill="FFFFFF" w:color="auto" w:val="clear"/>
+            <w:tcMar>
+              <w:top w:type="dxa" w:w="100"/>
+              <w:left w:type="dxa" w:w="140"/>
+              <w:bottom w:type="dxa" w:w="100"/>
+              <w:right w:type="dxa" w:w="140"/>
+            </w:tcMar>
+            <w:vAlign w:val="center"/>
+          </w:tcPr>
+          <w:p>
+            <w:pPr>
+              <w:jc w:val="left"/>
+            </w:pPr>
+            <w:r>
+              <w:rPr>
+                <w:b/>
+                <w:bCs/>
+                <w:color w:val="183A43"/>
+                <w:sz w:val="20"/>
+                <w:szCs w:val="20"/>
+              </w:rPr>
+              <w:t xml:space="preserve">Menú de usuario</w:t>
+            </w:r>
+          </w:p>
+        </w:tc>
+        <w:tc>
+          <w:tcPr>
+            <w:tcW w:type="dxa" w:w="3629"/>
+            <w:shd w:fill="FFFFFF" w:color="auto" w:val="clear"/>
+            <w:tcMar>
+              <w:top w:type="dxa" w:w="100"/>
+              <w:left w:type="dxa" w:w="140"/>
+              <w:bottom w:type="dxa" w:w="100"/>
+              <w:right w:type="dxa" w:w="140"/>
+            </w:tcMar>
+            <w:vAlign w:val="center"/>
+          </w:tcPr>
+          <w:p>
+            <w:pPr>
+              <w:jc w:val="left"/>
+            </w:pPr>
+            <w:r>
+              <w:rPr>
+                <w:b w:val="false"/>
+                <w:bCs w:val="false"/>
+                <w:color w:val="183A43"/>
+                <w:sz w:val="20"/>
+                <w:szCs w:val="20"/>
+              </w:rPr>
+              <w:t xml:space="preserve">Foto o iniciales, arriba a la derecha</w:t>
+            </w:r>
+          </w:p>
+        </w:tc>
+        <w:tc>
+          <w:tcPr>
+            <w:tcW w:type="dxa" w:w="3024"/>
+            <w:shd w:fill="FFFFFF" w:color="auto" w:val="clear"/>
             <w:tcMar>
               <w:top w:type="dxa" w:w="100"/>
               <w:left w:type="dxa" w:w="140"/>
@@ -2578,7 +2786,7 @@
           <w:sz w:val="22"/>
           <w:szCs w:val="22"/>
         </w:rPr>
-        <w:t xml:space="preserve">	Ingresé a la plataforma y ubiqué mi curso</w:t>
+        <w:t xml:space="preserve">	Ingresé a eCampus y ubiqué mi curso</w:t>
       </w:r>
     </w:p>
     <w:p>

</xml_diff>